<commit_message>
Restore Python version; keep Word report in Times New Roman
Brings back the scripts, data, docs and outputs removed in the previous
commit, and links the Word/Excel deliverables from the README.

Co-Authored-By: Claude Opus 5.5 <noreply@anthropic.com>
Claude-Session: https://claude.ai/code/session_014qGJ3HZzQyAPxVJVrV8CnU
</commit_message>
<xml_diff>
--- a/Controls-Crosswalk-Report.docx
+++ b/Controls-Crosswalk-Report.docx
@@ -8,6 +8,9 @@
         <w:pStyle w:val="Heading1"/>
       </w:pPr>
       <w:r>
+        <w:rPr>
+          <w:rFonts w:ascii="Times New Roman" w:hAnsi="Times New Roman" w:eastAsia="Times New Roman" w:cs="Times New Roman"/>
+        </w:rPr>
         <w:t xml:space="preserve">Why a Controls Crosswalk Matters</w:t>
       </w:r>
     </w:p>
@@ -17,6 +20,9 @@
         <w:pStyle w:val="Heading2"/>
       </w:pPr>
       <w:r>
+        <w:rPr>
+          <w:rFonts w:ascii="Times New Roman" w:hAnsi="Times New Roman" w:eastAsia="Times New Roman" w:cs="Times New Roman"/>
+        </w:rPr>
         <w:t xml:space="preserve">The problem it solves</w:t>
       </w:r>
     </w:p>
@@ -25,28 +31,47 @@
         <w:pStyle w:val="FirstParagraph"/>
       </w:pPr>
       <w:r>
+        <w:rPr>
+          <w:rFonts w:ascii="Times New Roman" w:hAnsi="Times New Roman" w:eastAsia="Times New Roman" w:cs="Times New Roman"/>
+        </w:rPr>
         <w:t xml:space="preserve">Most organizations have to satisfy</w:t>
       </w:r>
       <w:r>
-        <w:t xml:space="preserve"> </w:t>
-      </w:r>
-      <w:r>
-        <w:rPr>
+        <w:rPr>
+          <w:rFonts w:ascii="Times New Roman" w:hAnsi="Times New Roman" w:eastAsia="Times New Roman" w:cs="Times New Roman"/>
+        </w:rPr>
+        <w:t xml:space="preserve"> </w:t>
+      </w:r>
+      <w:r>
+        <w:rPr>
+          <w:rFonts w:ascii="Times New Roman" w:hAnsi="Times New Roman" w:eastAsia="Times New Roman" w:cs="Times New Roman"/>
           <w:bCs/>
           <w:b/>
         </w:rPr>
         <w:t xml:space="preserve">more than one</w:t>
       </w:r>
       <w:r>
-        <w:t xml:space="preserve"> </w:t>
-      </w:r>
-      <w:r>
+        <w:rPr>
+          <w:rFonts w:ascii="Times New Roman" w:hAnsi="Times New Roman" w:eastAsia="Times New Roman" w:cs="Times New Roman"/>
+        </w:rPr>
+        <w:t xml:space="preserve"> </w:t>
+      </w:r>
+      <w:r>
+        <w:rPr>
+          <w:rFonts w:ascii="Times New Roman" w:hAnsi="Times New Roman" w:eastAsia="Times New Roman" w:cs="Times New Roman"/>
+        </w:rPr>
         <w:t xml:space="preserve">security framework at the same</w:t>
       </w:r>
       <w:r>
-        <w:t xml:space="preserve"> </w:t>
-      </w:r>
-      <w:r>
+        <w:rPr>
+          <w:rFonts w:ascii="Times New Roman" w:hAnsi="Times New Roman" w:eastAsia="Times New Roman" w:cs="Times New Roman"/>
+        </w:rPr>
+        <w:t xml:space="preserve"> </w:t>
+      </w:r>
+      <w:r>
+        <w:rPr>
+          <w:rFonts w:ascii="Times New Roman" w:hAnsi="Times New Roman" w:eastAsia="Times New Roman" w:cs="Times New Roman"/>
+        </w:rPr>
         <w:t xml:space="preserve">time. A fintech might need:</w:t>
       </w:r>
     </w:p>
@@ -60,15 +85,22 @@
       </w:pPr>
       <w:r>
         <w:rPr>
+          <w:rFonts w:ascii="Times New Roman" w:hAnsi="Times New Roman" w:eastAsia="Times New Roman" w:cs="Times New Roman"/>
           <w:bCs/>
           <w:b/>
         </w:rPr>
         <w:t xml:space="preserve">NIST CSF 2.0</w:t>
       </w:r>
       <w:r>
-        <w:t xml:space="preserve"> </w:t>
-      </w:r>
-      <w:r>
+        <w:rPr>
+          <w:rFonts w:ascii="Times New Roman" w:hAnsi="Times New Roman" w:eastAsia="Times New Roman" w:cs="Times New Roman"/>
+        </w:rPr>
+        <w:t xml:space="preserve"> </w:t>
+      </w:r>
+      <w:r>
+        <w:rPr>
+          <w:rFonts w:ascii="Times New Roman" w:hAnsi="Times New Roman" w:eastAsia="Times New Roman" w:cs="Times New Roman"/>
+        </w:rPr>
         <w:t xml:space="preserve">as its internal program backbone,</w:t>
       </w:r>
     </w:p>
@@ -82,34 +114,54 @@
       </w:pPr>
       <w:r>
         <w:rPr>
+          <w:rFonts w:ascii="Times New Roman" w:hAnsi="Times New Roman" w:eastAsia="Times New Roman" w:cs="Times New Roman"/>
           <w:bCs/>
           <w:b/>
         </w:rPr>
         <w:t xml:space="preserve">SOC 2</w:t>
       </w:r>
       <w:r>
-        <w:t xml:space="preserve"> </w:t>
-      </w:r>
-      <w:r>
+        <w:rPr>
+          <w:rFonts w:ascii="Times New Roman" w:hAnsi="Times New Roman" w:eastAsia="Times New Roman" w:cs="Times New Roman"/>
+        </w:rPr>
+        <w:t xml:space="preserve"> </w:t>
+      </w:r>
+      <w:r>
+        <w:rPr>
+          <w:rFonts w:ascii="Times New Roman" w:hAnsi="Times New Roman" w:eastAsia="Times New Roman" w:cs="Times New Roman"/>
+        </w:rPr>
         <w:t xml:space="preserve">(which draws on controls like those in</w:t>
       </w:r>
       <w:r>
-        <w:t xml:space="preserve"> </w:t>
-      </w:r>
-      <w:r>
-        <w:rPr>
+        <w:rPr>
+          <w:rFonts w:ascii="Times New Roman" w:hAnsi="Times New Roman" w:eastAsia="Times New Roman" w:cs="Times New Roman"/>
+        </w:rPr>
+        <w:t xml:space="preserve"> </w:t>
+      </w:r>
+      <w:r>
+        <w:rPr>
+          <w:rFonts w:ascii="Times New Roman" w:hAnsi="Times New Roman" w:eastAsia="Times New Roman" w:cs="Times New Roman"/>
           <w:bCs/>
           <w:b/>
         </w:rPr>
         <w:t xml:space="preserve">NIST 800-53</w:t>
       </w:r>
       <w:r>
+        <w:rPr>
+          <w:rFonts w:ascii="Times New Roman" w:hAnsi="Times New Roman" w:eastAsia="Times New Roman" w:cs="Times New Roman"/>
+        </w:rPr>
         <w:t xml:space="preserve">) to sell to</w:t>
       </w:r>
       <w:r>
-        <w:t xml:space="preserve"> </w:t>
-      </w:r>
-      <w:r>
+        <w:rPr>
+          <w:rFonts w:ascii="Times New Roman" w:hAnsi="Times New Roman" w:eastAsia="Times New Roman" w:cs="Times New Roman"/>
+        </w:rPr>
+        <w:t xml:space="preserve"> </w:t>
+      </w:r>
+      <w:r>
+        <w:rPr>
+          <w:rFonts w:ascii="Times New Roman" w:hAnsi="Times New Roman" w:eastAsia="Times New Roman" w:cs="Times New Roman"/>
+        </w:rPr>
         <w:t xml:space="preserve">enterprise customers,</w:t>
       </w:r>
     </w:p>
@@ -123,15 +175,22 @@
       </w:pPr>
       <w:r>
         <w:rPr>
+          <w:rFonts w:ascii="Times New Roman" w:hAnsi="Times New Roman" w:eastAsia="Times New Roman" w:cs="Times New Roman"/>
           <w:bCs/>
           <w:b/>
         </w:rPr>
         <w:t xml:space="preserve">ISO/IEC 27001</w:t>
       </w:r>
       <w:r>
-        <w:t xml:space="preserve"> </w:t>
-      </w:r>
-      <w:r>
+        <w:rPr>
+          <w:rFonts w:ascii="Times New Roman" w:hAnsi="Times New Roman" w:eastAsia="Times New Roman" w:cs="Times New Roman"/>
+        </w:rPr>
+        <w:t xml:space="preserve"> </w:t>
+      </w:r>
+      <w:r>
+        <w:rPr>
+          <w:rFonts w:ascii="Times New Roman" w:hAnsi="Times New Roman" w:eastAsia="Times New Roman" w:cs="Times New Roman"/>
+        </w:rPr>
         <w:t xml:space="preserve">because an international partner requires certification, and</w:t>
       </w:r>
     </w:p>
@@ -145,15 +204,22 @@
       </w:pPr>
       <w:r>
         <w:rPr>
+          <w:rFonts w:ascii="Times New Roman" w:hAnsi="Times New Roman" w:eastAsia="Times New Roman" w:cs="Times New Roman"/>
           <w:bCs/>
           <w:b/>
         </w:rPr>
         <w:t xml:space="preserve">CIS Controls v8</w:t>
       </w:r>
       <w:r>
-        <w:t xml:space="preserve"> </w:t>
-      </w:r>
-      <w:r>
+        <w:rPr>
+          <w:rFonts w:ascii="Times New Roman" w:hAnsi="Times New Roman" w:eastAsia="Times New Roman" w:cs="Times New Roman"/>
+        </w:rPr>
+        <w:t xml:space="preserve"> </w:t>
+      </w:r>
+      <w:r>
+        <w:rPr>
+          <w:rFonts w:ascii="Times New Roman" w:hAnsi="Times New Roman" w:eastAsia="Times New Roman" w:cs="Times New Roman"/>
+        </w:rPr>
         <w:t xml:space="preserve">as the practical, prioritized checklist its engineers follow.</w:t>
       </w:r>
     </w:p>
@@ -162,52 +228,95 @@
         <w:pStyle w:val="FirstParagraph"/>
       </w:pPr>
       <w:r>
+        <w:rPr>
+          <w:rFonts w:ascii="Times New Roman" w:hAnsi="Times New Roman" w:eastAsia="Times New Roman" w:cs="Times New Roman"/>
+        </w:rPr>
         <w:t xml:space="preserve">Without a crosswalk, teams treat these as four separate projects — four audits,</w:t>
       </w:r>
       <w:r>
-        <w:t xml:space="preserve"> </w:t>
-      </w:r>
-      <w:r>
+        <w:rPr>
+          <w:rFonts w:ascii="Times New Roman" w:hAnsi="Times New Roman" w:eastAsia="Times New Roman" w:cs="Times New Roman"/>
+        </w:rPr>
+        <w:t xml:space="preserve"> </w:t>
+      </w:r>
+      <w:r>
+        <w:rPr>
+          <w:rFonts w:ascii="Times New Roman" w:hAnsi="Times New Roman" w:eastAsia="Times New Roman" w:cs="Times New Roman"/>
+        </w:rPr>
         <w:t xml:space="preserve">four evidence requests, four spreadsheets — even though the underlying controls</w:t>
       </w:r>
       <w:r>
-        <w:t xml:space="preserve"> </w:t>
-      </w:r>
-      <w:r>
+        <w:rPr>
+          <w:rFonts w:ascii="Times New Roman" w:hAnsi="Times New Roman" w:eastAsia="Times New Roman" w:cs="Times New Roman"/>
+        </w:rPr>
+        <w:t xml:space="preserve"> </w:t>
+      </w:r>
+      <w:r>
+        <w:rPr>
+          <w:rFonts w:ascii="Times New Roman" w:hAnsi="Times New Roman" w:eastAsia="Times New Roman" w:cs="Times New Roman"/>
+        </w:rPr>
         <w:t xml:space="preserve">overlap enormously.</w:t>
       </w:r>
       <w:r>
-        <w:t xml:space="preserve"> </w:t>
-      </w:r>
-      <w:r>
+        <w:rPr>
+          <w:rFonts w:ascii="Times New Roman" w:hAnsi="Times New Roman" w:eastAsia="Times New Roman" w:cs="Times New Roman"/>
+        </w:rPr>
+        <w:t xml:space="preserve"> </w:t>
+      </w:r>
+      <w:r>
+        <w:rPr>
+          <w:rFonts w:ascii="Times New Roman" w:hAnsi="Times New Roman" w:eastAsia="Times New Roman" w:cs="Times New Roman"/>
+        </w:rPr>
         <w:t xml:space="preserve">“</w:t>
       </w:r>
       <w:r>
+        <w:rPr>
+          <w:rFonts w:ascii="Times New Roman" w:hAnsi="Times New Roman" w:eastAsia="Times New Roman" w:cs="Times New Roman"/>
+        </w:rPr>
         <w:t xml:space="preserve">Enforce MFA</w:t>
       </w:r>
       <w:r>
+        <w:rPr>
+          <w:rFonts w:ascii="Times New Roman" w:hAnsi="Times New Roman" w:eastAsia="Times New Roman" w:cs="Times New Roman"/>
+        </w:rPr>
         <w:t xml:space="preserve">”</w:t>
       </w:r>
       <w:r>
-        <w:t xml:space="preserve"> </w:t>
-      </w:r>
-      <w:r>
+        <w:rPr>
+          <w:rFonts w:ascii="Times New Roman" w:hAnsi="Times New Roman" w:eastAsia="Times New Roman" w:cs="Times New Roman"/>
+        </w:rPr>
+        <w:t xml:space="preserve"> </w:t>
+      </w:r>
+      <w:r>
+        <w:rPr>
+          <w:rFonts w:ascii="Times New Roman" w:hAnsi="Times New Roman" w:eastAsia="Times New Roman" w:cs="Times New Roman"/>
+        </w:rPr>
         <w:t xml:space="preserve">is one control that satisfies a requirement in</w:t>
       </w:r>
       <w:r>
-        <w:t xml:space="preserve"> </w:t>
-      </w:r>
-      <w:r>
-        <w:rPr>
+        <w:rPr>
+          <w:rFonts w:ascii="Times New Roman" w:hAnsi="Times New Roman" w:eastAsia="Times New Roman" w:cs="Times New Roman"/>
+        </w:rPr>
+        <w:t xml:space="preserve"> </w:t>
+      </w:r>
+      <w:r>
+        <w:rPr>
+          <w:rFonts w:ascii="Times New Roman" w:hAnsi="Times New Roman" w:eastAsia="Times New Roman" w:cs="Times New Roman"/>
           <w:iCs/>
           <w:i/>
         </w:rPr>
         <w:t xml:space="preserve">every</w:t>
       </w:r>
       <w:r>
-        <w:t xml:space="preserve"> </w:t>
-      </w:r>
-      <w:r>
+        <w:rPr>
+          <w:rFonts w:ascii="Times New Roman" w:hAnsi="Times New Roman" w:eastAsia="Times New Roman" w:cs="Times New Roman"/>
+        </w:rPr>
+        <w:t xml:space="preserve"> </w:t>
+      </w:r>
+      <w:r>
+        <w:rPr>
+          <w:rFonts w:ascii="Times New Roman" w:hAnsi="Times New Roman" w:eastAsia="Times New Roman" w:cs="Times New Roman"/>
+        </w:rPr>
         <w:t xml:space="preserve">framework.</w:t>
       </w:r>
     </w:p>
@@ -218,6 +327,9 @@
         <w:pStyle w:val="Heading2"/>
       </w:pPr>
       <w:r>
+        <w:rPr>
+          <w:rFonts w:ascii="Times New Roman" w:hAnsi="Times New Roman" w:eastAsia="Times New Roman" w:cs="Times New Roman"/>
+        </w:rPr>
         <w:t xml:space="preserve">The principle: assess once, comply many</w:t>
       </w:r>
     </w:p>
@@ -226,6 +338,9 @@
         <w:pStyle w:val="FirstParagraph"/>
       </w:pPr>
       <w:r>
+        <w:rPr>
+          <w:rFonts w:ascii="Times New Roman" w:hAnsi="Times New Roman" w:eastAsia="Times New Roman" w:cs="Times New Roman"/>
+        </w:rPr>
         <w:t xml:space="preserve">A crosswalk maps each control area to its equivalent in every framework, so you can:</w:t>
       </w:r>
     </w:p>
@@ -239,37 +354,60 @@
       </w:pPr>
       <w:r>
         <w:rPr>
+          <w:rFonts w:ascii="Times New Roman" w:hAnsi="Times New Roman" w:eastAsia="Times New Roman" w:cs="Times New Roman"/>
           <w:bCs/>
           <w:b/>
         </w:rPr>
         <w:t xml:space="preserve">Collect evidence once</w:t>
       </w:r>
       <w:r>
-        <w:t xml:space="preserve"> </w:t>
-      </w:r>
-      <w:r>
+        <w:rPr>
+          <w:rFonts w:ascii="Times New Roman" w:hAnsi="Times New Roman" w:eastAsia="Times New Roman" w:cs="Times New Roman"/>
+        </w:rPr>
+        <w:t xml:space="preserve"> </w:t>
+      </w:r>
+      <w:r>
+        <w:rPr>
+          <w:rFonts w:ascii="Times New Roman" w:hAnsi="Times New Roman" w:eastAsia="Times New Roman" w:cs="Times New Roman"/>
+        </w:rPr>
         <w:t xml:space="preserve">and apply it to multiple audits (MFA evidence satisfies</w:t>
       </w:r>
       <w:r>
-        <w:t xml:space="preserve"> </w:t>
-      </w:r>
-      <w:r>
+        <w:rPr>
+          <w:rFonts w:ascii="Times New Roman" w:hAnsi="Times New Roman" w:eastAsia="Times New Roman" w:cs="Times New Roman"/>
+        </w:rPr>
+        <w:t xml:space="preserve"> </w:t>
+      </w:r>
+      <w:r>
+        <w:rPr>
+          <w:rFonts w:ascii="Times New Roman" w:hAnsi="Times New Roman" w:eastAsia="Times New Roman" w:cs="Times New Roman"/>
+        </w:rPr>
         <w:t xml:space="preserve">NIST, ISO,</w:t>
       </w:r>
       <w:r>
-        <w:t xml:space="preserve"> </w:t>
-      </w:r>
-      <w:r>
-        <w:rPr>
+        <w:rPr>
+          <w:rFonts w:ascii="Times New Roman" w:hAnsi="Times New Roman" w:eastAsia="Times New Roman" w:cs="Times New Roman"/>
+        </w:rPr>
+        <w:t xml:space="preserve"> </w:t>
+      </w:r>
+      <w:r>
+        <w:rPr>
+          <w:rFonts w:ascii="Times New Roman" w:hAnsi="Times New Roman" w:eastAsia="Times New Roman" w:cs="Times New Roman"/>
           <w:iCs/>
           <w:i/>
         </w:rPr>
         <w:t xml:space="preserve">and</w:t>
       </w:r>
       <w:r>
-        <w:t xml:space="preserve"> </w:t>
-      </w:r>
-      <w:r>
+        <w:rPr>
+          <w:rFonts w:ascii="Times New Roman" w:hAnsi="Times New Roman" w:eastAsia="Times New Roman" w:cs="Times New Roman"/>
+        </w:rPr>
+        <w:t xml:space="preserve"> </w:t>
+      </w:r>
+      <w:r>
+        <w:rPr>
+          <w:rFonts w:ascii="Times New Roman" w:hAnsi="Times New Roman" w:eastAsia="Times New Roman" w:cs="Times New Roman"/>
+        </w:rPr>
         <w:t xml:space="preserve">CIS at the same time).</w:t>
       </w:r>
     </w:p>
@@ -283,21 +421,34 @@
       </w:pPr>
       <w:r>
         <w:rPr>
+          <w:rFonts w:ascii="Times New Roman" w:hAnsi="Times New Roman" w:eastAsia="Times New Roman" w:cs="Times New Roman"/>
           <w:bCs/>
           <w:b/>
         </w:rPr>
         <w:t xml:space="preserve">See coverage gaps</w:t>
       </w:r>
       <w:r>
-        <w:t xml:space="preserve"> </w:t>
-      </w:r>
-      <w:r>
+        <w:rPr>
+          <w:rFonts w:ascii="Times New Roman" w:hAnsi="Times New Roman" w:eastAsia="Times New Roman" w:cs="Times New Roman"/>
+        </w:rPr>
+        <w:t xml:space="preserve"> </w:t>
+      </w:r>
+      <w:r>
+        <w:rPr>
+          <w:rFonts w:ascii="Times New Roman" w:hAnsi="Times New Roman" w:eastAsia="Times New Roman" w:cs="Times New Roman"/>
+        </w:rPr>
         <w:t xml:space="preserve">— if a control is required by ISO but you only track it in</w:t>
       </w:r>
       <w:r>
-        <w:t xml:space="preserve"> </w:t>
-      </w:r>
-      <w:r>
+        <w:rPr>
+          <w:rFonts w:ascii="Times New Roman" w:hAnsi="Times New Roman" w:eastAsia="Times New Roman" w:cs="Times New Roman"/>
+        </w:rPr>
+        <w:t xml:space="preserve"> </w:t>
+      </w:r>
+      <w:r>
+        <w:rPr>
+          <w:rFonts w:ascii="Times New Roman" w:hAnsi="Times New Roman" w:eastAsia="Times New Roman" w:cs="Times New Roman"/>
+        </w:rPr>
         <w:t xml:space="preserve">CIS, the crosswalk surfaces it.</w:t>
       </w:r>
     </w:p>
@@ -311,21 +462,34 @@
       </w:pPr>
       <w:r>
         <w:rPr>
+          <w:rFonts w:ascii="Times New Roman" w:hAnsi="Times New Roman" w:eastAsia="Times New Roman" w:cs="Times New Roman"/>
           <w:bCs/>
           <w:b/>
         </w:rPr>
         <w:t xml:space="preserve">Translate between auditors</w:t>
       </w:r>
       <w:r>
-        <w:t xml:space="preserve"> </w:t>
-      </w:r>
-      <w:r>
+        <w:rPr>
+          <w:rFonts w:ascii="Times New Roman" w:hAnsi="Times New Roman" w:eastAsia="Times New Roman" w:cs="Times New Roman"/>
+        </w:rPr>
+        <w:t xml:space="preserve"> </w:t>
+      </w:r>
+      <w:r>
+        <w:rPr>
+          <w:rFonts w:ascii="Times New Roman" w:hAnsi="Times New Roman" w:eastAsia="Times New Roman" w:cs="Times New Roman"/>
+        </w:rPr>
         <w:t xml:space="preserve">— a SOC 2 auditor speaks 800-53-style controls; an</w:t>
       </w:r>
       <w:r>
-        <w:t xml:space="preserve"> </w:t>
-      </w:r>
-      <w:r>
+        <w:rPr>
+          <w:rFonts w:ascii="Times New Roman" w:hAnsi="Times New Roman" w:eastAsia="Times New Roman" w:cs="Times New Roman"/>
+        </w:rPr>
+        <w:t xml:space="preserve"> </w:t>
+      </w:r>
+      <w:r>
+        <w:rPr>
+          <w:rFonts w:ascii="Times New Roman" w:hAnsi="Times New Roman" w:eastAsia="Times New Roman" w:cs="Times New Roman"/>
+        </w:rPr>
         <w:t xml:space="preserve">ISO auditor speaks Annex A. The crosswalk lets one control conversation serve both.</w:t>
       </w:r>
     </w:p>
@@ -339,51 +503,94 @@
       </w:pPr>
       <w:r>
         <w:rPr>
+          <w:rFonts w:ascii="Times New Roman" w:hAnsi="Times New Roman" w:eastAsia="Times New Roman" w:cs="Times New Roman"/>
           <w:bCs/>
           <w:b/>
         </w:rPr>
         <w:t xml:space="preserve">Scope a new framework fast</w:t>
       </w:r>
       <w:r>
-        <w:t xml:space="preserve"> </w:t>
-      </w:r>
-      <w:r>
+        <w:rPr>
+          <w:rFonts w:ascii="Times New Roman" w:hAnsi="Times New Roman" w:eastAsia="Times New Roman" w:cs="Times New Roman"/>
+        </w:rPr>
+        <w:t xml:space="preserve"> </w:t>
+      </w:r>
+      <w:r>
+        <w:rPr>
+          <w:rFonts w:ascii="Times New Roman" w:hAnsi="Times New Roman" w:eastAsia="Times New Roman" w:cs="Times New Roman"/>
+        </w:rPr>
         <w:t xml:space="preserve">— adopting ISO 27001 when you already run NIST CSF</w:t>
       </w:r>
       <w:r>
-        <w:t xml:space="preserve"> </w:t>
-      </w:r>
-      <w:r>
+        <w:rPr>
+          <w:rFonts w:ascii="Times New Roman" w:hAnsi="Times New Roman" w:eastAsia="Times New Roman" w:cs="Times New Roman"/>
+        </w:rPr>
+        <w:t xml:space="preserve"> </w:t>
+      </w:r>
+      <w:r>
+        <w:rPr>
+          <w:rFonts w:ascii="Times New Roman" w:hAnsi="Times New Roman" w:eastAsia="Times New Roman" w:cs="Times New Roman"/>
+        </w:rPr>
         <w:t xml:space="preserve">becomes</w:t>
       </w:r>
       <w:r>
-        <w:t xml:space="preserve"> </w:t>
-      </w:r>
-      <w:r>
+        <w:rPr>
+          <w:rFonts w:ascii="Times New Roman" w:hAnsi="Times New Roman" w:eastAsia="Times New Roman" w:cs="Times New Roman"/>
+        </w:rPr>
+        <w:t xml:space="preserve"> </w:t>
+      </w:r>
+      <w:r>
+        <w:rPr>
+          <w:rFonts w:ascii="Times New Roman" w:hAnsi="Times New Roman" w:eastAsia="Times New Roman" w:cs="Times New Roman"/>
+        </w:rPr>
         <w:t xml:space="preserve">“</w:t>
       </w:r>
       <w:r>
+        <w:rPr>
+          <w:rFonts w:ascii="Times New Roman" w:hAnsi="Times New Roman" w:eastAsia="Times New Roman" w:cs="Times New Roman"/>
+        </w:rPr>
         <w:t xml:space="preserve">what’s the delta?</w:t>
       </w:r>
       <w:r>
+        <w:rPr>
+          <w:rFonts w:ascii="Times New Roman" w:hAnsi="Times New Roman" w:eastAsia="Times New Roman" w:cs="Times New Roman"/>
+        </w:rPr>
         <w:t xml:space="preserve">”</w:t>
       </w:r>
       <w:r>
-        <w:t xml:space="preserve"> </w:t>
-      </w:r>
-      <w:r>
+        <w:rPr>
+          <w:rFonts w:ascii="Times New Roman" w:hAnsi="Times New Roman" w:eastAsia="Times New Roman" w:cs="Times New Roman"/>
+        </w:rPr>
+        <w:t xml:space="preserve"> </w:t>
+      </w:r>
+      <w:r>
+        <w:rPr>
+          <w:rFonts w:ascii="Times New Roman" w:hAnsi="Times New Roman" w:eastAsia="Times New Roman" w:cs="Times New Roman"/>
+        </w:rPr>
         <w:t xml:space="preserve">instead of</w:t>
       </w:r>
       <w:r>
-        <w:t xml:space="preserve"> </w:t>
-      </w:r>
-      <w:r>
+        <w:rPr>
+          <w:rFonts w:ascii="Times New Roman" w:hAnsi="Times New Roman" w:eastAsia="Times New Roman" w:cs="Times New Roman"/>
+        </w:rPr>
+        <w:t xml:space="preserve"> </w:t>
+      </w:r>
+      <w:r>
+        <w:rPr>
+          <w:rFonts w:ascii="Times New Roman" w:hAnsi="Times New Roman" w:eastAsia="Times New Roman" w:cs="Times New Roman"/>
+        </w:rPr>
         <w:t xml:space="preserve">“</w:t>
       </w:r>
       <w:r>
+        <w:rPr>
+          <w:rFonts w:ascii="Times New Roman" w:hAnsi="Times New Roman" w:eastAsia="Times New Roman" w:cs="Times New Roman"/>
+        </w:rPr>
         <w:t xml:space="preserve">start from zero.</w:t>
       </w:r>
       <w:r>
+        <w:rPr>
+          <w:rFonts w:ascii="Times New Roman" w:hAnsi="Times New Roman" w:eastAsia="Times New Roman" w:cs="Times New Roman"/>
+        </w:rPr>
         <w:t xml:space="preserve">”</w:t>
       </w:r>
     </w:p>
@@ -392,12 +599,21 @@
         <w:pStyle w:val="FirstParagraph"/>
       </w:pPr>
       <w:r>
+        <w:rPr>
+          <w:rFonts w:ascii="Times New Roman" w:hAnsi="Times New Roman" w:eastAsia="Times New Roman" w:cs="Times New Roman"/>
+        </w:rPr>
         <w:t xml:space="preserve">This is a core efficiency lever in real GRC programs and a major reason compliance</w:t>
       </w:r>
       <w:r>
-        <w:t xml:space="preserve"> </w:t>
-      </w:r>
-      <w:r>
+        <w:rPr>
+          <w:rFonts w:ascii="Times New Roman" w:hAnsi="Times New Roman" w:eastAsia="Times New Roman" w:cs="Times New Roman"/>
+        </w:rPr>
+        <w:t xml:space="preserve"> </w:t>
+      </w:r>
+      <w:r>
+        <w:rPr>
+          <w:rFonts w:ascii="Times New Roman" w:hAnsi="Times New Roman" w:eastAsia="Times New Roman" w:cs="Times New Roman"/>
+        </w:rPr>
         <w:t xml:space="preserve">automation platforms (Vanta, Drata, OneTrust) exist.</w:t>
       </w:r>
     </w:p>
@@ -408,6 +624,9 @@
         <w:pStyle w:val="Heading2"/>
       </w:pPr>
       <w:r>
+        <w:rPr>
+          <w:rFonts w:ascii="Times New Roman" w:hAnsi="Times New Roman" w:eastAsia="Times New Roman" w:cs="Times New Roman"/>
+        </w:rPr>
         <w:t xml:space="preserve">The important caveat: mappings are many-to-many and approximate</w:t>
       </w:r>
     </w:p>
@@ -416,12 +635,21 @@
         <w:pStyle w:val="FirstParagraph"/>
       </w:pPr>
       <w:r>
+        <w:rPr>
+          <w:rFonts w:ascii="Times New Roman" w:hAnsi="Times New Roman" w:eastAsia="Times New Roman" w:cs="Times New Roman"/>
+        </w:rPr>
         <w:t xml:space="preserve">Frameworks are written at different levels of granularity, so mappings are rarely</w:t>
       </w:r>
       <w:r>
-        <w:t xml:space="preserve"> </w:t>
-      </w:r>
-      <w:r>
+        <w:rPr>
+          <w:rFonts w:ascii="Times New Roman" w:hAnsi="Times New Roman" w:eastAsia="Times New Roman" w:cs="Times New Roman"/>
+        </w:rPr>
+        <w:t xml:space="preserve"> </w:t>
+      </w:r>
+      <w:r>
+        <w:rPr>
+          <w:rFonts w:ascii="Times New Roman" w:hAnsi="Times New Roman" w:eastAsia="Times New Roman" w:cs="Times New Roman"/>
+        </w:rPr>
         <w:t xml:space="preserve">one-to-one:</w:t>
       </w:r>
     </w:p>
@@ -434,38 +662,61 @@
         <w:pStyle w:val="Compact"/>
       </w:pPr>
       <w:r>
+        <w:rPr>
+          <w:rFonts w:ascii="Times New Roman" w:hAnsi="Times New Roman" w:eastAsia="Times New Roman" w:cs="Times New Roman"/>
+        </w:rPr>
         <w:t xml:space="preserve">One</w:t>
       </w:r>
       <w:r>
-        <w:t xml:space="preserve"> </w:t>
-      </w:r>
-      <w:r>
-        <w:rPr>
+        <w:rPr>
+          <w:rFonts w:ascii="Times New Roman" w:hAnsi="Times New Roman" w:eastAsia="Times New Roman" w:cs="Times New Roman"/>
+        </w:rPr>
+        <w:t xml:space="preserve"> </w:t>
+      </w:r>
+      <w:r>
+        <w:rPr>
+          <w:rFonts w:ascii="Times New Roman" w:hAnsi="Times New Roman" w:eastAsia="Times New Roman" w:cs="Times New Roman"/>
           <w:bCs/>
           <w:b/>
         </w:rPr>
         <w:t xml:space="preserve">NIST CSF</w:t>
       </w:r>
       <w:r>
-        <w:t xml:space="preserve"> </w:t>
-      </w:r>
-      <w:r>
+        <w:rPr>
+          <w:rFonts w:ascii="Times New Roman" w:hAnsi="Times New Roman" w:eastAsia="Times New Roman" w:cs="Times New Roman"/>
+        </w:rPr>
+        <w:t xml:space="preserve"> </w:t>
+      </w:r>
+      <w:r>
+        <w:rPr>
+          <w:rFonts w:ascii="Times New Roman" w:hAnsi="Times New Roman" w:eastAsia="Times New Roman" w:cs="Times New Roman"/>
+        </w:rPr>
         <w:t xml:space="preserve">subcategory often maps to</w:t>
       </w:r>
       <w:r>
-        <w:t xml:space="preserve"> </w:t>
-      </w:r>
-      <w:r>
-        <w:rPr>
+        <w:rPr>
+          <w:rFonts w:ascii="Times New Roman" w:hAnsi="Times New Roman" w:eastAsia="Times New Roman" w:cs="Times New Roman"/>
+        </w:rPr>
+        <w:t xml:space="preserve"> </w:t>
+      </w:r>
+      <w:r>
+        <w:rPr>
+          <w:rFonts w:ascii="Times New Roman" w:hAnsi="Times New Roman" w:eastAsia="Times New Roman" w:cs="Times New Roman"/>
           <w:bCs/>
           <w:b/>
         </w:rPr>
         <w:t xml:space="preserve">several</w:t>
       </w:r>
       <w:r>
-        <w:t xml:space="preserve"> </w:t>
-      </w:r>
-      <w:r>
+        <w:rPr>
+          <w:rFonts w:ascii="Times New Roman" w:hAnsi="Times New Roman" w:eastAsia="Times New Roman" w:cs="Times New Roman"/>
+        </w:rPr>
+        <w:t xml:space="preserve"> </w:t>
+      </w:r>
+      <w:r>
+        <w:rPr>
+          <w:rFonts w:ascii="Times New Roman" w:hAnsi="Times New Roman" w:eastAsia="Times New Roman" w:cs="Times New Roman"/>
+        </w:rPr>
         <w:t xml:space="preserve">800-53 controls.</w:t>
       </w:r>
     </w:p>
@@ -478,22 +729,35 @@
         <w:pStyle w:val="Compact"/>
       </w:pPr>
       <w:r>
+        <w:rPr>
+          <w:rFonts w:ascii="Times New Roman" w:hAnsi="Times New Roman" w:eastAsia="Times New Roman" w:cs="Times New Roman"/>
+        </w:rPr>
         <w:t xml:space="preserve">One</w:t>
       </w:r>
       <w:r>
-        <w:t xml:space="preserve"> </w:t>
-      </w:r>
-      <w:r>
-        <w:rPr>
+        <w:rPr>
+          <w:rFonts w:ascii="Times New Roman" w:hAnsi="Times New Roman" w:eastAsia="Times New Roman" w:cs="Times New Roman"/>
+        </w:rPr>
+        <w:t xml:space="preserve"> </w:t>
+      </w:r>
+      <w:r>
+        <w:rPr>
+          <w:rFonts w:ascii="Times New Roman" w:hAnsi="Times New Roman" w:eastAsia="Times New Roman" w:cs="Times New Roman"/>
           <w:bCs/>
           <w:b/>
         </w:rPr>
         <w:t xml:space="preserve">ISO 27001</w:t>
       </w:r>
       <w:r>
-        <w:t xml:space="preserve"> </w:t>
-      </w:r>
-      <w:r>
+        <w:rPr>
+          <w:rFonts w:ascii="Times New Roman" w:hAnsi="Times New Roman" w:eastAsia="Times New Roman" w:cs="Times New Roman"/>
+        </w:rPr>
+        <w:t xml:space="preserve"> </w:t>
+      </w:r>
+      <w:r>
+        <w:rPr>
+          <w:rFonts w:ascii="Times New Roman" w:hAnsi="Times New Roman" w:eastAsia="Times New Roman" w:cs="Times New Roman"/>
+        </w:rPr>
         <w:t xml:space="preserve">Annex A control can relate to multiple CIS safeguards.</w:t>
       </w:r>
     </w:p>
@@ -506,43 +770,72 @@
         <w:pStyle w:val="Compact"/>
       </w:pPr>
       <w:r>
+        <w:rPr>
+          <w:rFonts w:ascii="Times New Roman" w:hAnsi="Times New Roman" w:eastAsia="Times New Roman" w:cs="Times New Roman"/>
+        </w:rPr>
         <w:t xml:space="preserve">Some controls exist in one framework and have</w:t>
       </w:r>
       <w:r>
-        <w:t xml:space="preserve"> </w:t>
-      </w:r>
-      <w:r>
-        <w:rPr>
+        <w:rPr>
+          <w:rFonts w:ascii="Times New Roman" w:hAnsi="Times New Roman" w:eastAsia="Times New Roman" w:cs="Times New Roman"/>
+        </w:rPr>
+        <w:t xml:space="preserve"> </w:t>
+      </w:r>
+      <w:r>
+        <w:rPr>
+          <w:rFonts w:ascii="Times New Roman" w:hAnsi="Times New Roman" w:eastAsia="Times New Roman" w:cs="Times New Roman"/>
           <w:bCs/>
           <w:b/>
         </w:rPr>
         <w:t xml:space="preserve">no clean equivalent</w:t>
       </w:r>
       <w:r>
-        <w:t xml:space="preserve"> </w:t>
-      </w:r>
-      <w:r>
+        <w:rPr>
+          <w:rFonts w:ascii="Times New Roman" w:hAnsi="Times New Roman" w:eastAsia="Times New Roman" w:cs="Times New Roman"/>
+        </w:rPr>
+        <w:t xml:space="preserve"> </w:t>
+      </w:r>
+      <w:r>
+        <w:rPr>
+          <w:rFonts w:ascii="Times New Roman" w:hAnsi="Times New Roman" w:eastAsia="Times New Roman" w:cs="Times New Roman"/>
+        </w:rPr>
         <w:t xml:space="preserve">in another</w:t>
       </w:r>
       <w:r>
-        <w:t xml:space="preserve"> </w:t>
-      </w:r>
-      <w:r>
+        <w:rPr>
+          <w:rFonts w:ascii="Times New Roman" w:hAnsi="Times New Roman" w:eastAsia="Times New Roman" w:cs="Times New Roman"/>
+        </w:rPr>
+        <w:t xml:space="preserve"> </w:t>
+      </w:r>
+      <w:r>
+        <w:rPr>
+          <w:rFonts w:ascii="Times New Roman" w:hAnsi="Times New Roman" w:eastAsia="Times New Roman" w:cs="Times New Roman"/>
+        </w:rPr>
         <w:t xml:space="preserve">(shown as</w:t>
       </w:r>
       <w:r>
-        <w:t xml:space="preserve"> </w:t>
-      </w:r>
-      <w:r>
-        <w:rPr>
+        <w:rPr>
+          <w:rFonts w:ascii="Times New Roman" w:hAnsi="Times New Roman" w:eastAsia="Times New Roman" w:cs="Times New Roman"/>
+        </w:rPr>
+        <w:t xml:space="preserve"> </w:t>
+      </w:r>
+      <w:r>
+        <w:rPr>
+          <w:rFonts w:ascii="Times New Roman" w:hAnsi="Times New Roman" w:eastAsia="Times New Roman" w:cs="Times New Roman"/>
           <w:rStyle w:val="VerbatimChar"/>
         </w:rPr>
         <w:t xml:space="preserve">—</w:t>
       </w:r>
       <w:r>
-        <w:t xml:space="preserve"> </w:t>
-      </w:r>
-      <w:r>
+        <w:rPr>
+          <w:rFonts w:ascii="Times New Roman" w:hAnsi="Times New Roman" w:eastAsia="Times New Roman" w:cs="Times New Roman"/>
+        </w:rPr>
+        <w:t xml:space="preserve"> </w:t>
+      </w:r>
+      <w:r>
+        <w:rPr>
+          <w:rFonts w:ascii="Times New Roman" w:hAnsi="Times New Roman" w:eastAsia="Times New Roman" w:cs="Times New Roman"/>
+        </w:rPr>
         <w:t xml:space="preserve">in the data).</w:t>
       </w:r>
     </w:p>
@@ -551,73 +844,137 @@
         <w:pStyle w:val="FirstParagraph"/>
       </w:pPr>
       <w:r>
+        <w:rPr>
+          <w:rFonts w:ascii="Times New Roman" w:hAnsi="Times New Roman" w:eastAsia="Times New Roman" w:cs="Times New Roman"/>
+        </w:rPr>
         <w:t xml:space="preserve">A crosswalk is therefore a</w:t>
       </w:r>
       <w:r>
-        <w:t xml:space="preserve"> </w:t>
-      </w:r>
-      <w:r>
-        <w:rPr>
+        <w:rPr>
+          <w:rFonts w:ascii="Times New Roman" w:hAnsi="Times New Roman" w:eastAsia="Times New Roman" w:cs="Times New Roman"/>
+        </w:rPr>
+        <w:t xml:space="preserve"> </w:t>
+      </w:r>
+      <w:r>
+        <w:rPr>
+          <w:rFonts w:ascii="Times New Roman" w:hAnsi="Times New Roman" w:eastAsia="Times New Roman" w:cs="Times New Roman"/>
           <w:bCs/>
           <w:b/>
         </w:rPr>
         <w:t xml:space="preserve">professional judgment artifact</w:t>
       </w:r>
       <w:r>
+        <w:rPr>
+          <w:rFonts w:ascii="Times New Roman" w:hAnsi="Times New Roman" w:eastAsia="Times New Roman" w:cs="Times New Roman"/>
+        </w:rPr>
         <w:t xml:space="preserve">, not a lookup table of</w:t>
       </w:r>
       <w:r>
-        <w:t xml:space="preserve"> </w:t>
-      </w:r>
-      <w:r>
+        <w:rPr>
+          <w:rFonts w:ascii="Times New Roman" w:hAnsi="Times New Roman" w:eastAsia="Times New Roman" w:cs="Times New Roman"/>
+        </w:rPr>
+        <w:t xml:space="preserve"> </w:t>
+      </w:r>
+      <w:r>
+        <w:rPr>
+          <w:rFonts w:ascii="Times New Roman" w:hAnsi="Times New Roman" w:eastAsia="Times New Roman" w:cs="Times New Roman"/>
+        </w:rPr>
         <w:t xml:space="preserve">exact equals. This is itself an interview-worthy point: good GRC analysts know that</w:t>
       </w:r>
       <w:r>
-        <w:t xml:space="preserve"> </w:t>
-      </w:r>
-      <w:r>
+        <w:rPr>
+          <w:rFonts w:ascii="Times New Roman" w:hAnsi="Times New Roman" w:eastAsia="Times New Roman" w:cs="Times New Roman"/>
+        </w:rPr>
+        <w:t xml:space="preserve"> </w:t>
+      </w:r>
+      <w:r>
+        <w:rPr>
+          <w:rFonts w:ascii="Times New Roman" w:hAnsi="Times New Roman" w:eastAsia="Times New Roman" w:cs="Times New Roman"/>
+        </w:rPr>
         <w:t xml:space="preserve">“</w:t>
       </w:r>
       <w:r>
+        <w:rPr>
+          <w:rFonts w:ascii="Times New Roman" w:hAnsi="Times New Roman" w:eastAsia="Times New Roman" w:cs="Times New Roman"/>
+        </w:rPr>
         <w:t xml:space="preserve">mapped</w:t>
       </w:r>
       <w:r>
+        <w:rPr>
+          <w:rFonts w:ascii="Times New Roman" w:hAnsi="Times New Roman" w:eastAsia="Times New Roman" w:cs="Times New Roman"/>
+        </w:rPr>
         <w:t xml:space="preserve">”</w:t>
       </w:r>
       <w:r>
-        <w:t xml:space="preserve"> </w:t>
-      </w:r>
-      <w:r>
+        <w:rPr>
+          <w:rFonts w:ascii="Times New Roman" w:hAnsi="Times New Roman" w:eastAsia="Times New Roman" w:cs="Times New Roman"/>
+        </w:rPr>
+        <w:t xml:space="preserve"> </w:t>
+      </w:r>
+      <w:r>
+        <w:rPr>
+          <w:rFonts w:ascii="Times New Roman" w:hAnsi="Times New Roman" w:eastAsia="Times New Roman" w:cs="Times New Roman"/>
+        </w:rPr>
         <w:t xml:space="preserve">means</w:t>
       </w:r>
       <w:r>
-        <w:t xml:space="preserve"> </w:t>
-      </w:r>
-      <w:r>
+        <w:rPr>
+          <w:rFonts w:ascii="Times New Roman" w:hAnsi="Times New Roman" w:eastAsia="Times New Roman" w:cs="Times New Roman"/>
+        </w:rPr>
+        <w:t xml:space="preserve"> </w:t>
+      </w:r>
+      <w:r>
+        <w:rPr>
+          <w:rFonts w:ascii="Times New Roman" w:hAnsi="Times New Roman" w:eastAsia="Times New Roman" w:cs="Times New Roman"/>
+        </w:rPr>
         <w:t xml:space="preserve">“</w:t>
       </w:r>
       <w:r>
+        <w:rPr>
+          <w:rFonts w:ascii="Times New Roman" w:hAnsi="Times New Roman" w:eastAsia="Times New Roman" w:cs="Times New Roman"/>
+        </w:rPr>
         <w:t xml:space="preserve">addresses the same control objective,</w:t>
       </w:r>
       <w:r>
+        <w:rPr>
+          <w:rFonts w:ascii="Times New Roman" w:hAnsi="Times New Roman" w:eastAsia="Times New Roman" w:cs="Times New Roman"/>
+        </w:rPr>
         <w:t xml:space="preserve">”</w:t>
       </w:r>
       <w:r>
-        <w:t xml:space="preserve"> </w:t>
-      </w:r>
-      <w:r>
+        <w:rPr>
+          <w:rFonts w:ascii="Times New Roman" w:hAnsi="Times New Roman" w:eastAsia="Times New Roman" w:cs="Times New Roman"/>
+        </w:rPr>
+        <w:t xml:space="preserve"> </w:t>
+      </w:r>
+      <w:r>
+        <w:rPr>
+          <w:rFonts w:ascii="Times New Roman" w:hAnsi="Times New Roman" w:eastAsia="Times New Roman" w:cs="Times New Roman"/>
+        </w:rPr>
         <w:t xml:space="preserve">not</w:t>
       </w:r>
       <w:r>
-        <w:t xml:space="preserve"> </w:t>
-      </w:r>
-      <w:r>
+        <w:rPr>
+          <w:rFonts w:ascii="Times New Roman" w:hAnsi="Times New Roman" w:eastAsia="Times New Roman" w:cs="Times New Roman"/>
+        </w:rPr>
+        <w:t xml:space="preserve"> </w:t>
+      </w:r>
+      <w:r>
+        <w:rPr>
+          <w:rFonts w:ascii="Times New Roman" w:hAnsi="Times New Roman" w:eastAsia="Times New Roman" w:cs="Times New Roman"/>
+        </w:rPr>
         <w:t xml:space="preserve">“</w:t>
       </w:r>
       <w:r>
+        <w:rPr>
+          <w:rFonts w:ascii="Times New Roman" w:hAnsi="Times New Roman" w:eastAsia="Times New Roman" w:cs="Times New Roman"/>
+        </w:rPr>
         <w:t xml:space="preserve">identical.</w:t>
       </w:r>
       <w:r>
+        <w:rPr>
+          <w:rFonts w:ascii="Times New Roman" w:hAnsi="Times New Roman" w:eastAsia="Times New Roman" w:cs="Times New Roman"/>
+        </w:rPr>
         <w:t xml:space="preserve">”</w:t>
       </w:r>
     </w:p>
@@ -628,6 +985,9 @@
         <w:pStyle w:val="Heading2"/>
       </w:pPr>
       <w:r>
+        <w:rPr>
+          <w:rFonts w:ascii="Times New Roman" w:hAnsi="Times New Roman" w:eastAsia="Times New Roman" w:cs="Times New Roman"/>
+        </w:rPr>
         <w:t xml:space="preserve">Framework quick-reference</w:t>
       </w:r>
     </w:p>
@@ -655,6 +1015,9 @@
               <w:jc w:val="left"/>
             </w:pPr>
             <w:r>
+              <w:rPr>
+                <w:rFonts w:ascii="Times New Roman" w:hAnsi="Times New Roman" w:eastAsia="Times New Roman" w:cs="Times New Roman"/>
+              </w:rPr>
               <w:t xml:space="preserve">Framework</w:t>
             </w:r>
           </w:p>
@@ -667,6 +1030,9 @@
               <w:jc w:val="left"/>
             </w:pPr>
             <w:r>
+              <w:rPr>
+                <w:rFonts w:ascii="Times New Roman" w:hAnsi="Times New Roman" w:eastAsia="Times New Roman" w:cs="Times New Roman"/>
+              </w:rPr>
               <w:t xml:space="preserve">What it is</w:t>
             </w:r>
           </w:p>
@@ -679,6 +1045,9 @@
               <w:jc w:val="left"/>
             </w:pPr>
             <w:r>
+              <w:rPr>
+                <w:rFonts w:ascii="Times New Roman" w:hAnsi="Times New Roman" w:eastAsia="Times New Roman" w:cs="Times New Roman"/>
+              </w:rPr>
               <w:t xml:space="preserve">ID style</w:t>
             </w:r>
           </w:p>
@@ -694,6 +1063,7 @@
             </w:pPr>
             <w:r>
               <w:rPr>
+                <w:rFonts w:ascii="Times New Roman" w:hAnsi="Times New Roman" w:eastAsia="Times New Roman" w:cs="Times New Roman"/>
                 <w:bCs/>
                 <w:b/>
               </w:rPr>
@@ -709,6 +1079,9 @@
               <w:jc w:val="left"/>
             </w:pPr>
             <w:r>
+              <w:rPr>
+                <w:rFonts w:ascii="Times New Roman" w:hAnsi="Times New Roman" w:eastAsia="Times New Roman" w:cs="Times New Roman"/>
+              </w:rPr>
               <w:t xml:space="preserve">Outcome-based framework; 6 functions (GV, ID, PR, DE, RS, RC)</w:t>
             </w:r>
           </w:p>
@@ -722,6 +1095,7 @@
             </w:pPr>
             <w:r>
               <w:rPr>
+                <w:rFonts w:ascii="Times New Roman" w:hAnsi="Times New Roman" w:eastAsia="Times New Roman" w:cs="Times New Roman"/>
                 <w:rStyle w:val="VerbatimChar"/>
               </w:rPr>
               <w:t xml:space="preserve">PR.AA-03</w:t>
@@ -739,6 +1113,7 @@
             </w:pPr>
             <w:r>
               <w:rPr>
+                <w:rFonts w:ascii="Times New Roman" w:hAnsi="Times New Roman" w:eastAsia="Times New Roman" w:cs="Times New Roman"/>
                 <w:bCs/>
                 <w:b/>
               </w:rPr>
@@ -754,6 +1129,9 @@
               <w:jc w:val="left"/>
             </w:pPr>
             <w:r>
+              <w:rPr>
+                <w:rFonts w:ascii="Times New Roman" w:hAnsi="Times New Roman" w:eastAsia="Times New Roman" w:cs="Times New Roman"/>
+              </w:rPr>
               <w:t xml:space="preserve">Detailed federal control catalog; control families (AC, IA, IR…)</w:t>
             </w:r>
           </w:p>
@@ -767,6 +1145,7 @@
             </w:pPr>
             <w:r>
               <w:rPr>
+                <w:rFonts w:ascii="Times New Roman" w:hAnsi="Times New Roman" w:eastAsia="Times New Roman" w:cs="Times New Roman"/>
                 <w:rStyle w:val="VerbatimChar"/>
               </w:rPr>
               <w:t xml:space="preserve">IA-2(1)</w:t>
@@ -784,6 +1163,7 @@
             </w:pPr>
             <w:r>
               <w:rPr>
+                <w:rFonts w:ascii="Times New Roman" w:hAnsi="Times New Roman" w:eastAsia="Times New Roman" w:cs="Times New Roman"/>
                 <w:bCs/>
                 <w:b/>
               </w:rPr>
@@ -799,6 +1179,9 @@
               <w:jc w:val="left"/>
             </w:pPr>
             <w:r>
+              <w:rPr>
+                <w:rFonts w:ascii="Times New Roman" w:hAnsi="Times New Roman" w:eastAsia="Times New Roman" w:cs="Times New Roman"/>
+              </w:rPr>
               <w:t xml:space="preserve">International ISMS standard; Annex A, 93 controls in 4 themes</w:t>
             </w:r>
           </w:p>
@@ -812,6 +1195,7 @@
             </w:pPr>
             <w:r>
               <w:rPr>
+                <w:rFonts w:ascii="Times New Roman" w:hAnsi="Times New Roman" w:eastAsia="Times New Roman" w:cs="Times New Roman"/>
                 <w:rStyle w:val="VerbatimChar"/>
               </w:rPr>
               <w:t xml:space="preserve">A.8.5</w:t>
@@ -829,6 +1213,7 @@
             </w:pPr>
             <w:r>
               <w:rPr>
+                <w:rFonts w:ascii="Times New Roman" w:hAnsi="Times New Roman" w:eastAsia="Times New Roman" w:cs="Times New Roman"/>
                 <w:bCs/>
                 <w:b/>
               </w:rPr>
@@ -844,6 +1229,9 @@
               <w:jc w:val="left"/>
             </w:pPr>
             <w:r>
+              <w:rPr>
+                <w:rFonts w:ascii="Times New Roman" w:hAnsi="Times New Roman" w:eastAsia="Times New Roman" w:cs="Times New Roman"/>
+              </w:rPr>
               <w:t xml:space="preserve">Prioritized, practical safeguards; 18 controls</w:t>
             </w:r>
           </w:p>
@@ -857,6 +1245,7 @@
             </w:pPr>
             <w:r>
               <w:rPr>
+                <w:rFonts w:ascii="Times New Roman" w:hAnsi="Times New Roman" w:eastAsia="Times New Roman" w:cs="Times New Roman"/>
                 <w:rStyle w:val="VerbatimChar"/>
               </w:rPr>
               <w:t xml:space="preserve">6.3</w:t>
@@ -872,6 +1261,9 @@
         <w:pStyle w:val="Heading2"/>
       </w:pPr>
       <w:r>
+        <w:rPr>
+          <w:rFonts w:ascii="Times New Roman" w:hAnsi="Times New Roman" w:eastAsia="Times New Roman" w:cs="Times New Roman"/>
+        </w:rPr>
         <w:t xml:space="preserve">Provenance of this crosswalk</w:t>
       </w:r>
     </w:p>
@@ -880,28 +1272,47 @@
         <w:pStyle w:val="FirstParagraph"/>
       </w:pPr>
       <w:r>
+        <w:rPr>
+          <w:rFonts w:ascii="Times New Roman" w:hAnsi="Times New Roman" w:eastAsia="Times New Roman" w:cs="Times New Roman"/>
+        </w:rPr>
         <w:t xml:space="preserve">The mappings here are</w:t>
       </w:r>
       <w:r>
-        <w:t xml:space="preserve"> </w:t>
-      </w:r>
-      <w:r>
-        <w:rPr>
+        <w:rPr>
+          <w:rFonts w:ascii="Times New Roman" w:hAnsi="Times New Roman" w:eastAsia="Times New Roman" w:cs="Times New Roman"/>
+        </w:rPr>
+        <w:t xml:space="preserve"> </w:t>
+      </w:r>
+      <w:r>
+        <w:rPr>
+          <w:rFonts w:ascii="Times New Roman" w:hAnsi="Times New Roman" w:eastAsia="Times New Roman" w:cs="Times New Roman"/>
           <w:bCs/>
           <w:b/>
         </w:rPr>
         <w:t xml:space="preserve">curated for education</w:t>
       </w:r>
       <w:r>
-        <w:t xml:space="preserve"> </w:t>
-      </w:r>
-      <w:r>
+        <w:rPr>
+          <w:rFonts w:ascii="Times New Roman" w:hAnsi="Times New Roman" w:eastAsia="Times New Roman" w:cs="Times New Roman"/>
+        </w:rPr>
+        <w:t xml:space="preserve"> </w:t>
+      </w:r>
+      <w:r>
+        <w:rPr>
+          <w:rFonts w:ascii="Times New Roman" w:hAnsi="Times New Roman" w:eastAsia="Times New Roman" w:cs="Times New Roman"/>
+        </w:rPr>
         <w:t xml:space="preserve">and aligned to the direction of the</w:t>
       </w:r>
       <w:r>
-        <w:t xml:space="preserve"> </w:t>
-      </w:r>
-      <w:r>
+        <w:rPr>
+          <w:rFonts w:ascii="Times New Roman" w:hAnsi="Times New Roman" w:eastAsia="Times New Roman" w:cs="Times New Roman"/>
+        </w:rPr>
+        <w:t xml:space="preserve"> </w:t>
+      </w:r>
+      <w:r>
+        <w:rPr>
+          <w:rFonts w:ascii="Times New Roman" w:hAnsi="Times New Roman" w:eastAsia="Times New Roman" w:cs="Times New Roman"/>
+        </w:rPr>
         <w:t xml:space="preserve">published authoritative sources:</w:t>
       </w:r>
     </w:p>
@@ -914,44 +1325,73 @@
         <w:pStyle w:val="Compact"/>
       </w:pPr>
       <w:r>
+        <w:rPr>
+          <w:rFonts w:ascii="Times New Roman" w:hAnsi="Times New Roman" w:eastAsia="Times New Roman" w:cs="Times New Roman"/>
+        </w:rPr>
         <w:t xml:space="preserve">NIST CSF 2.0</w:t>
       </w:r>
       <w:r>
-        <w:t xml:space="preserve"> </w:t>
-      </w:r>
-      <w:r>
-        <w:rPr>
+        <w:rPr>
+          <w:rFonts w:ascii="Times New Roman" w:hAnsi="Times New Roman" w:eastAsia="Times New Roman" w:cs="Times New Roman"/>
+        </w:rPr>
+        <w:t xml:space="preserve"> </w:t>
+      </w:r>
+      <w:r>
+        <w:rPr>
+          <w:rFonts w:ascii="Times New Roman" w:hAnsi="Times New Roman" w:eastAsia="Times New Roman" w:cs="Times New Roman"/>
           <w:bCs/>
           <w:b/>
         </w:rPr>
         <w:t xml:space="preserve">Informative References</w:t>
       </w:r>
       <w:r>
-        <w:t xml:space="preserve"> </w:t>
-      </w:r>
-      <w:r>
+        <w:rPr>
+          <w:rFonts w:ascii="Times New Roman" w:hAnsi="Times New Roman" w:eastAsia="Times New Roman" w:cs="Times New Roman"/>
+        </w:rPr>
+        <w:t xml:space="preserve"> </w:t>
+      </w:r>
+      <w:r>
+        <w:rPr>
+          <w:rFonts w:ascii="Times New Roman" w:hAnsi="Times New Roman" w:eastAsia="Times New Roman" w:cs="Times New Roman"/>
+        </w:rPr>
         <w:t xml:space="preserve">(and the NIST</w:t>
       </w:r>
       <w:r>
-        <w:t xml:space="preserve"> </w:t>
-      </w:r>
-      <w:r>
-        <w:rPr>
+        <w:rPr>
+          <w:rFonts w:ascii="Times New Roman" w:hAnsi="Times New Roman" w:eastAsia="Times New Roman" w:cs="Times New Roman"/>
+        </w:rPr>
+        <w:t xml:space="preserve"> </w:t>
+      </w:r>
+      <w:r>
+        <w:rPr>
+          <w:rFonts w:ascii="Times New Roman" w:hAnsi="Times New Roman" w:eastAsia="Times New Roman" w:cs="Times New Roman"/>
           <w:bCs/>
           <w:b/>
         </w:rPr>
         <w:t xml:space="preserve">OLIR</w:t>
       </w:r>
       <w:r>
-        <w:t xml:space="preserve"> </w:t>
-      </w:r>
-      <w:r>
+        <w:rPr>
+          <w:rFonts w:ascii="Times New Roman" w:hAnsi="Times New Roman" w:eastAsia="Times New Roman" w:cs="Times New Roman"/>
+        </w:rPr>
+        <w:t xml:space="preserve"> </w:t>
+      </w:r>
+      <w:r>
+        <w:rPr>
+          <w:rFonts w:ascii="Times New Roman" w:hAnsi="Times New Roman" w:eastAsia="Times New Roman" w:cs="Times New Roman"/>
+        </w:rPr>
         <w:t xml:space="preserve">program, which</w:t>
       </w:r>
       <w:r>
-        <w:t xml:space="preserve"> </w:t>
-      </w:r>
-      <w:r>
+        <w:rPr>
+          <w:rFonts w:ascii="Times New Roman" w:hAnsi="Times New Roman" w:eastAsia="Times New Roman" w:cs="Times New Roman"/>
+        </w:rPr>
+        <w:t xml:space="preserve"> </w:t>
+      </w:r>
+      <w:r>
+        <w:rPr>
+          <w:rFonts w:ascii="Times New Roman" w:hAnsi="Times New Roman" w:eastAsia="Times New Roman" w:cs="Times New Roman"/>
+        </w:rPr>
         <w:t xml:space="preserve">publishes official framework-to-framework mappings).</w:t>
       </w:r>
     </w:p>
@@ -965,15 +1405,22 @@
       </w:pPr>
       <w:r>
         <w:rPr>
+          <w:rFonts w:ascii="Times New Roman" w:hAnsi="Times New Roman" w:eastAsia="Times New Roman" w:cs="Times New Roman"/>
           <w:bCs/>
           <w:b/>
         </w:rPr>
         <w:t xml:space="preserve">CIS Controls v8</w:t>
       </w:r>
       <w:r>
-        <w:t xml:space="preserve"> </w:t>
-      </w:r>
-      <w:r>
+        <w:rPr>
+          <w:rFonts w:ascii="Times New Roman" w:hAnsi="Times New Roman" w:eastAsia="Times New Roman" w:cs="Times New Roman"/>
+        </w:rPr>
+        <w:t xml:space="preserve"> </w:t>
+      </w:r>
+      <w:r>
+        <w:rPr>
+          <w:rFonts w:ascii="Times New Roman" w:hAnsi="Times New Roman" w:eastAsia="Times New Roman" w:cs="Times New Roman"/>
+        </w:rPr>
         <w:t xml:space="preserve">mappings to NIST CSF / 800-53 / ISO 27001 (CIS publishes these).</w:t>
       </w:r>
     </w:p>
@@ -987,15 +1434,22 @@
       </w:pPr>
       <w:r>
         <w:rPr>
+          <w:rFonts w:ascii="Times New Roman" w:hAnsi="Times New Roman" w:eastAsia="Times New Roman" w:cs="Times New Roman"/>
           <w:bCs/>
           <w:b/>
         </w:rPr>
         <w:t xml:space="preserve">ISO/IEC 27001:2022 Annex A</w:t>
       </w:r>
       <w:r>
-        <w:t xml:space="preserve"> </w:t>
-      </w:r>
-      <w:r>
+        <w:rPr>
+          <w:rFonts w:ascii="Times New Roman" w:hAnsi="Times New Roman" w:eastAsia="Times New Roman" w:cs="Times New Roman"/>
+        </w:rPr>
+        <w:t xml:space="preserve"> </w:t>
+      </w:r>
+      <w:r>
+        <w:rPr>
+          <w:rFonts w:ascii="Times New Roman" w:hAnsi="Times New Roman" w:eastAsia="Times New Roman" w:cs="Times New Roman"/>
+        </w:rPr>
         <w:t xml:space="preserve">control set.</w:t>
       </w:r>
     </w:p>
@@ -1004,17 +1458,29 @@
         <w:pStyle w:val="FirstParagraph"/>
       </w:pPr>
       <w:r>
+        <w:rPr>
+          <w:rFonts w:ascii="Times New Roman" w:hAnsi="Times New Roman" w:eastAsia="Times New Roman" w:cs="Times New Roman"/>
+        </w:rPr>
         <w:t xml:space="preserve">They are representative, not exhaustive, and should be validated against the current</w:t>
       </w:r>
       <w:r>
-        <w:t xml:space="preserve"> </w:t>
-      </w:r>
-      <w:r>
+        <w:rPr>
+          <w:rFonts w:ascii="Times New Roman" w:hAnsi="Times New Roman" w:eastAsia="Times New Roman" w:cs="Times New Roman"/>
+        </w:rPr>
+        <w:t xml:space="preserve"> </w:t>
+      </w:r>
+      <w:r>
+        <w:rPr>
+          <w:rFonts w:ascii="Times New Roman" w:hAnsi="Times New Roman" w:eastAsia="Times New Roman" w:cs="Times New Roman"/>
+        </w:rPr>
         <w:t xml:space="preserve">official source documents before use in a real audit.</w:t>
       </w:r>
     </w:p>
     <w:p>
       <w:r>
+        <w:rPr>
+          <w:rFonts w:ascii="Times New Roman" w:hAnsi="Times New Roman" w:eastAsia="Times New Roman" w:cs="Times New Roman"/>
+        </w:rPr>
         <w:pict>
           <v:rect style="width:0;height:1.5pt" o:hralign="center" o:hrstd="t" o:hr="t"/>
         </w:pict>
@@ -1022,7 +1488,10 @@
     </w:p>
     <w:bookmarkEnd w:id="24"/>
     <w:bookmarkEnd w:id="25"/>
-    <w:sectPr/>
+    <w:sectPr>
+      <w:headerReference w:type="default" r:id="rId9"/>
+      <w:footerReference w:type="default" r:id="rId10"/>
+    </w:sectPr>
   </w:body>
 </w:document>
 </file>
@@ -1031,6 +1500,16 @@
 <w:comments xmlns:w="http://schemas.openxmlformats.org/wordprocessingml/2006/main" xmlns:m="http://schemas.openxmlformats.org/officeDocument/2006/math" xmlns:r="http://schemas.openxmlformats.org/officeDocument/2006/relationships" xmlns:o="urn:schemas-microsoft-com:office:office" xmlns:v="urn:schemas-microsoft-com:vml" xmlns:w10="urn:schemas-microsoft-com:office:word" xmlns:a="http://schemas.openxmlformats.org/drawingml/2006/main" xmlns:pic="http://schemas.openxmlformats.org/drawingml/2006/picture" xmlns:wp="http://schemas.openxmlformats.org/drawingml/2006/wordprocessingDrawing"/>
 </file>
 
+<file path=word/footer1.xml><?xml version="1.0" encoding="utf-8"?>
+<w:ftr xmlns:m="http://schemas.openxmlformats.org/officeDocument/2006/math" xmlns:mc="http://schemas.openxmlformats.org/markup-compatibility/2006" xmlns:mo="http://schemas.microsoft.com/office/mac/office/2008/main" xmlns:mv="urn:schemas-microsoft-com:mac:vml" xmlns:o="urn:schemas-microsoft-com:office:office" xmlns:r="http://schemas.openxmlformats.org/officeDocument/2006/relationships" xmlns:v="urn:schemas-microsoft-com:vml" xmlns:w10="urn:schemas-microsoft-com:office:word" xmlns:w14="http://schemas.microsoft.com/office/word/2010/wordml" xmlns:w="http://schemas.openxmlformats.org/wordprocessingml/2006/main" xmlns:wne="http://schemas.microsoft.com/office/word/2006/wordml" xmlns:wp14="http://schemas.microsoft.com/office/word/2010/wordprocessingDrawing" xmlns:wp="http://schemas.openxmlformats.org/drawingml/2006/wordprocessingDrawing" xmlns:wpc="http://schemas.microsoft.com/office/word/2010/wordprocessingCanvas" xmlns:wpg="http://schemas.microsoft.com/office/word/2010/wordprocessingGroup" xmlns:wpi="http://schemas.microsoft.com/office/word/2010/wordprocessingInk" xmlns:wps="http://schemas.microsoft.com/office/word/2010/wordprocessingShape" mc:Ignorable="w14 wp14">
+  <w:p>
+    <w:pPr>
+      <w:pStyle w:val="Footer"/>
+    </w:pPr>
+  </w:p>
+</w:ftr>
+</file>
+
 <file path=word/footnotes.xml><?xml version="1.0" encoding="utf-8"?>
 <w:footnotes xmlns:w="http://schemas.openxmlformats.org/wordprocessingml/2006/main" xmlns:m="http://schemas.openxmlformats.org/officeDocument/2006/math" xmlns:r="http://schemas.openxmlformats.org/officeDocument/2006/relationships" xmlns:o="urn:schemas-microsoft-com:office:office" xmlns:v="urn:schemas-microsoft-com:vml" xmlns:w10="urn:schemas-microsoft-com:office:word" xmlns:a="http://schemas.openxmlformats.org/drawingml/2006/main" xmlns:pic="http://schemas.openxmlformats.org/drawingml/2006/picture" xmlns:wp="http://schemas.openxmlformats.org/drawingml/2006/wordprocessingDrawing">
   <w:footnote w:type="continuationSeparator" w:id="0">
@@ -1048,6 +1527,16 @@
     </w:p>
   </w:footnote>
 </w:footnotes>
+</file>
+
+<file path=word/header1.xml><?xml version="1.0" encoding="utf-8"?>
+<w:hdr xmlns:m="http://schemas.openxmlformats.org/officeDocument/2006/math" xmlns:mc="http://schemas.openxmlformats.org/markup-compatibility/2006" xmlns:mo="http://schemas.microsoft.com/office/mac/office/2008/main" xmlns:mv="urn:schemas-microsoft-com:mac:vml" xmlns:o="urn:schemas-microsoft-com:office:office" xmlns:r="http://schemas.openxmlformats.org/officeDocument/2006/relationships" xmlns:v="urn:schemas-microsoft-com:vml" xmlns:w10="urn:schemas-microsoft-com:office:word" xmlns:w14="http://schemas.microsoft.com/office/word/2010/wordml" xmlns:w="http://schemas.openxmlformats.org/wordprocessingml/2006/main" xmlns:wne="http://schemas.microsoft.com/office/word/2006/wordml" xmlns:wp14="http://schemas.microsoft.com/office/word/2010/wordprocessingDrawing" xmlns:wp="http://schemas.openxmlformats.org/drawingml/2006/wordprocessingDrawing" xmlns:wpc="http://schemas.microsoft.com/office/word/2010/wordprocessingCanvas" xmlns:wpg="http://schemas.microsoft.com/office/word/2010/wordprocessingGroup" xmlns:wpi="http://schemas.microsoft.com/office/word/2010/wordprocessingInk" xmlns:wps="http://schemas.microsoft.com/office/word/2010/wordprocessingShape" mc:Ignorable="w14 wp14">
+  <w:p>
+    <w:pPr>
+      <w:pStyle w:val="Header"/>
+    </w:pPr>
+  </w:p>
+</w:hdr>
 </file>
 
 <file path=word/numbering.xml><?xml version="1.0" encoding="utf-8"?>
@@ -1227,7 +1716,7 @@
   <w:docDefaults>
     <w:rPrDefault>
       <w:rPr>
-        <w:rFonts w:asciiTheme="minorHAnsi" w:cstheme="minorBidi" w:eastAsiaTheme="minorHAnsi" w:hAnsiTheme="minorHAnsi"/>
+        <w:rFonts w:ascii="Times New Roman" w:hAnsi="Times New Roman" w:eastAsia="Times New Roman" w:cs="Times New Roman"/>
         <w:sz w:val="24"/>
         <w:szCs w:val="24"/>
         <w:lang w:bidi="ar-SA" w:eastAsia="en-US" w:val="en-US"/>
@@ -1243,6 +1732,9 @@
   <w:style w:default="1" w:styleId="Normal" w:type="paragraph">
     <w:name w:val="Normal"/>
     <w:qFormat/>
+    <w:rPr>
+      <w:rFonts w:ascii="Times New Roman" w:hAnsi="Times New Roman" w:eastAsia="Times New Roman" w:cs="Times New Roman"/>
+    </w:rPr>
   </w:style>
   <w:style w:styleId="BodyText" w:type="paragraph">
     <w:name w:val="Body Text"/>
@@ -1252,12 +1744,18 @@
       <w:spacing w:after="180" w:before="180"/>
     </w:pPr>
     <w:qFormat/>
+    <w:rPr>
+      <w:rFonts w:ascii="Times New Roman" w:hAnsi="Times New Roman" w:eastAsia="Times New Roman" w:cs="Times New Roman"/>
+    </w:rPr>
   </w:style>
   <w:style w:customStyle="1" w:styleId="FirstParagraph" w:type="paragraph">
     <w:name w:val="First Paragraph"/>
     <w:basedOn w:val="BodyText"/>
     <w:next w:val="BodyText"/>
     <w:qFormat/>
+    <w:rPr>
+      <w:rFonts w:ascii="Times New Roman" w:hAnsi="Times New Roman" w:eastAsia="Times New Roman" w:cs="Times New Roman"/>
+    </w:rPr>
   </w:style>
   <w:style w:customStyle="1" w:styleId="Compact" w:type="paragraph">
     <w:name w:val="Compact"/>
@@ -1266,6 +1764,9 @@
     <w:pPr>
       <w:spacing w:after="36" w:before="36"/>
     </w:pPr>
+    <w:rPr>
+      <w:rFonts w:ascii="Times New Roman" w:hAnsi="Times New Roman" w:eastAsia="Times New Roman" w:cs="Times New Roman"/>
+    </w:rPr>
   </w:style>
   <w:style w:styleId="Title" w:type="paragraph">
     <w:name w:val="Title"/>
@@ -1279,7 +1780,7 @@
       <w:jc w:val="center"/>
     </w:pPr>
     <w:rPr>
-      <w:rFonts w:asciiTheme="majorHAnsi" w:cstheme="majorBidi" w:eastAsiaTheme="majorEastAsia" w:hAnsiTheme="majorHAnsi"/>
+      <w:rFonts w:ascii="Times New Roman" w:hAnsi="Times New Roman" w:eastAsia="Times New Roman" w:cs="Times New Roman"/>
       <w:b/>
       <w:bCs/>
       <w:color w:themeColor="accent1" w:themeShade="B5" w:val="345A8A"/>
@@ -1299,6 +1800,7 @@
       <w:jc w:val="center"/>
     </w:pPr>
     <w:rPr>
+      <w:rFonts w:ascii="Times New Roman" w:hAnsi="Times New Roman" w:eastAsia="Times New Roman" w:cs="Times New Roman"/>
       <w:sz w:val="30"/>
       <w:szCs w:val="30"/>
     </w:rPr>
@@ -1312,6 +1814,9 @@
       <w:keepLines/>
       <w:jc w:val="center"/>
     </w:pPr>
+    <w:rPr>
+      <w:rFonts w:ascii="Times New Roman" w:hAnsi="Times New Roman" w:eastAsia="Times New Roman" w:cs="Times New Roman"/>
+    </w:rPr>
   </w:style>
   <w:style w:styleId="Date" w:type="paragraph">
     <w:name w:val="Date"/>
@@ -1322,6 +1827,9 @@
       <w:keepLines/>
       <w:jc w:val="center"/>
     </w:pPr>
+    <w:rPr>
+      <w:rFonts w:ascii="Times New Roman" w:hAnsi="Times New Roman" w:eastAsia="Times New Roman" w:cs="Times New Roman"/>
+    </w:rPr>
   </w:style>
   <w:style w:customStyle="1" w:styleId="AbstractTitle" w:type="paragraph">
     <w:name w:val="Abstract Title"/>
@@ -1335,6 +1843,7 @@
       <w:spacing w:after="0" w:before="300"/>
     </w:pPr>
     <w:rPr>
+      <w:rFonts w:ascii="Times New Roman" w:hAnsi="Times New Roman" w:eastAsia="Times New Roman" w:cs="Times New Roman"/>
       <w:sz w:val="20"/>
       <w:szCs w:val="20"/>
       <w:b/>
@@ -1353,6 +1862,7 @@
       <w:spacing w:after="300" w:before="100"/>
     </w:pPr>
     <w:rPr>
+      <w:rFonts w:ascii="Times New Roman" w:hAnsi="Times New Roman" w:eastAsia="Times New Roman" w:cs="Times New Roman"/>
       <w:sz w:val="20"/>
       <w:szCs w:val="20"/>
     </w:rPr>
@@ -1363,7 +1873,9 @@
     <w:next w:val="Bibliography"/>
     <w:qFormat/>
     <w:pPr/>
-    <w:rPr/>
+    <w:rPr>
+      <w:rFonts w:ascii="Times New Roman" w:hAnsi="Times New Roman" w:eastAsia="Times New Roman" w:cs="Times New Roman"/>
+    </w:rPr>
   </w:style>
   <w:style w:styleId="Heading1" w:type="paragraph">
     <w:name w:val="Heading 1"/>
@@ -1378,7 +1890,7 @@
       <w:outlineLvl w:val="0"/>
     </w:pPr>
     <w:rPr>
-      <w:rFonts w:asciiTheme="majorHAnsi" w:cstheme="majorBidi" w:eastAsiaTheme="majorEastAsia" w:hAnsiTheme="majorHAnsi"/>
+      <w:rFonts w:ascii="Times New Roman" w:hAnsi="Times New Roman" w:eastAsia="Times New Roman" w:cs="Times New Roman"/>
       <w:b/>
       <w:bCs/>
       <w:color w:themeColor="accent1" w:val="4F81BD"/>
@@ -1400,7 +1912,7 @@
       <w:outlineLvl w:val="1"/>
     </w:pPr>
     <w:rPr>
-      <w:rFonts w:asciiTheme="majorHAnsi" w:cstheme="majorBidi" w:eastAsiaTheme="majorEastAsia" w:hAnsiTheme="majorHAnsi"/>
+      <w:rFonts w:ascii="Times New Roman" w:hAnsi="Times New Roman" w:eastAsia="Times New Roman" w:cs="Times New Roman"/>
       <w:b/>
       <w:bCs/>
       <w:color w:themeColor="accent1" w:val="4F81BD"/>
@@ -1422,7 +1934,7 @@
       <w:outlineLvl w:val="2"/>
     </w:pPr>
     <w:rPr>
-      <w:rFonts w:asciiTheme="majorHAnsi" w:cstheme="majorBidi" w:eastAsiaTheme="majorEastAsia" w:hAnsiTheme="majorHAnsi"/>
+      <w:rFonts w:ascii="Times New Roman" w:hAnsi="Times New Roman" w:eastAsia="Times New Roman" w:cs="Times New Roman"/>
       <w:b/>
       <w:bCs/>
       <w:color w:themeColor="accent1" w:val="4F81BD"/>
@@ -1444,7 +1956,7 @@
       <w:outlineLvl w:val="3"/>
     </w:pPr>
     <w:rPr>
-      <w:rFonts w:asciiTheme="majorHAnsi" w:cstheme="majorBidi" w:eastAsiaTheme="majorEastAsia" w:hAnsiTheme="majorHAnsi"/>
+      <w:rFonts w:ascii="Times New Roman" w:hAnsi="Times New Roman" w:eastAsia="Times New Roman" w:cs="Times New Roman"/>
       <w:i/>
       <w:bCs/>
       <w:color w:themeColor="accent1" w:val="4F81BD"/>
@@ -1466,7 +1978,7 @@
       <w:outlineLvl w:val="4"/>
     </w:pPr>
     <w:rPr>
-      <w:rFonts w:asciiTheme="majorHAnsi" w:cstheme="majorBidi" w:eastAsiaTheme="majorEastAsia" w:hAnsiTheme="majorHAnsi"/>
+      <w:rFonts w:ascii="Times New Roman" w:hAnsi="Times New Roman" w:eastAsia="Times New Roman" w:cs="Times New Roman"/>
       <w:iCs/>
       <w:color w:themeColor="accent1" w:val="4F81BD"/>
       <w:sz w:val="24"/>
@@ -1487,7 +1999,7 @@
       <w:outlineLvl w:val="5"/>
     </w:pPr>
     <w:rPr>
-      <w:rFonts w:asciiTheme="majorHAnsi" w:cstheme="majorBidi" w:eastAsiaTheme="majorEastAsia" w:hAnsiTheme="majorHAnsi"/>
+      <w:rFonts w:ascii="Times New Roman" w:hAnsi="Times New Roman" w:eastAsia="Times New Roman" w:cs="Times New Roman"/>
       <w:color w:themeColor="accent1" w:val="4F81BD"/>
       <w:sz w:val="24"/>
       <w:szCs w:val="24"/>
@@ -1507,7 +2019,7 @@
       <w:outlineLvl w:val="6"/>
     </w:pPr>
     <w:rPr>
-      <w:rFonts w:asciiTheme="majorHAnsi" w:cstheme="majorBidi" w:eastAsiaTheme="majorEastAsia" w:hAnsiTheme="majorHAnsi"/>
+      <w:rFonts w:ascii="Times New Roman" w:hAnsi="Times New Roman" w:eastAsia="Times New Roman" w:cs="Times New Roman"/>
       <w:color w:themeColor="accent1" w:val="4F81BD"/>
       <w:sz w:val="24"/>
       <w:szCs w:val="24"/>
@@ -1527,7 +2039,7 @@
       <w:outlineLvl w:val="7"/>
     </w:pPr>
     <w:rPr>
-      <w:rFonts w:asciiTheme="majorHAnsi" w:cstheme="majorBidi" w:eastAsiaTheme="majorEastAsia" w:hAnsiTheme="majorHAnsi"/>
+      <w:rFonts w:ascii="Times New Roman" w:hAnsi="Times New Roman" w:eastAsia="Times New Roman" w:cs="Times New Roman"/>
       <w:color w:themeColor="accent1" w:val="4F81BD"/>
       <w:sz w:val="24"/>
       <w:szCs w:val="24"/>
@@ -1547,7 +2059,7 @@
       <w:outlineLvl w:val="8"/>
     </w:pPr>
     <w:rPr>
-      <w:rFonts w:asciiTheme="majorHAnsi" w:cstheme="majorBidi" w:eastAsiaTheme="majorEastAsia" w:hAnsiTheme="majorHAnsi"/>
+      <w:rFonts w:ascii="Times New Roman" w:hAnsi="Times New Roman" w:eastAsia="Times New Roman" w:cs="Times New Roman"/>
       <w:color w:themeColor="accent1" w:val="4F81BD"/>
       <w:sz w:val="24"/>
       <w:szCs w:val="24"/>
@@ -1564,6 +2076,9 @@
       <w:spacing w:after="100" w:before="100"/>
       <w:ind w:firstLine="0" w:left="480" w:right="480"/>
     </w:pPr>
+    <w:rPr>
+      <w:rFonts w:ascii="Times New Roman" w:hAnsi="Times New Roman" w:eastAsia="Times New Roman" w:cs="Times New Roman"/>
+    </w:rPr>
   </w:style>
   <w:style w:styleId="FootnoteText" w:type="paragraph">
     <w:name w:val="Footnote Text"/>
@@ -1572,11 +2087,17 @@
     <w:uiPriority w:val="9"/>
     <w:unhideWhenUsed/>
     <w:qFormat/>
+    <w:rPr>
+      <w:rFonts w:ascii="Times New Roman" w:hAnsi="Times New Roman" w:eastAsia="Times New Roman" w:cs="Times New Roman"/>
+    </w:rPr>
   </w:style>
   <w:style w:default="1" w:styleId="DefaultParagraphFont" w:type="character">
     <w:name w:val="Default Paragraph Font"/>
     <w:semiHidden/>
     <w:unhideWhenUsed/>
+    <w:rPr>
+      <w:rFonts w:ascii="Times New Roman" w:hAnsi="Times New Roman" w:eastAsia="Times New Roman" w:cs="Times New Roman"/>
+    </w:rPr>
   </w:style>
   <w:style w:default="1" w:styleId="Table" w:type="table">
     <w:name w:val="Table"/>
@@ -1608,6 +2129,9 @@
         </w:tcBorders>
       </w:tcPr>
     </w:tblStylePr>
+    <w:rPr>
+      <w:rFonts w:ascii="Times New Roman" w:hAnsi="Times New Roman" w:eastAsia="Times New Roman" w:cs="Times New Roman"/>
+    </w:rPr>
   </w:style>
   <w:style w:customStyle="1" w:styleId="DefinitionTerm" w:type="paragraph">
     <w:name w:val="Definition Term"/>
@@ -1619,12 +2143,16 @@
       <w:spacing w:after="0"/>
     </w:pPr>
     <w:rPr>
+      <w:rFonts w:ascii="Times New Roman" w:hAnsi="Times New Roman" w:eastAsia="Times New Roman" w:cs="Times New Roman"/>
       <w:b/>
     </w:rPr>
   </w:style>
   <w:style w:customStyle="1" w:styleId="Definition" w:type="paragraph">
     <w:name w:val="Definition"/>
     <w:basedOn w:val="Normal"/>
+    <w:rPr>
+      <w:rFonts w:ascii="Times New Roman" w:hAnsi="Times New Roman" w:eastAsia="Times New Roman" w:cs="Times New Roman"/>
+    </w:rPr>
   </w:style>
   <w:style w:styleId="Caption" w:type="paragraph">
     <w:name w:val="Caption"/>
@@ -1634,6 +2162,7 @@
       <w:spacing w:after="120" w:before="0"/>
     </w:pPr>
     <w:rPr>
+      <w:rFonts w:ascii="Times New Roman" w:hAnsi="Times New Roman" w:eastAsia="Times New Roman" w:cs="Times New Roman"/>
       <w:i/>
     </w:rPr>
   </w:style>
@@ -1643,14 +2172,23 @@
     <w:pPr>
       <w:keepNext/>
     </w:pPr>
+    <w:rPr>
+      <w:rFonts w:ascii="Times New Roman" w:hAnsi="Times New Roman" w:eastAsia="Times New Roman" w:cs="Times New Roman"/>
+    </w:rPr>
   </w:style>
   <w:style w:customStyle="1" w:styleId="ImageCaption" w:type="paragraph">
     <w:name w:val="Image Caption"/>
     <w:basedOn w:val="Caption"/>
+    <w:rPr>
+      <w:rFonts w:ascii="Times New Roman" w:hAnsi="Times New Roman" w:eastAsia="Times New Roman" w:cs="Times New Roman"/>
+    </w:rPr>
   </w:style>
   <w:style w:customStyle="1" w:styleId="Figure" w:type="paragraph">
     <w:name w:val="Figure"/>
     <w:basedOn w:val="Normal"/>
+    <w:rPr>
+      <w:rFonts w:ascii="Times New Roman" w:hAnsi="Times New Roman" w:eastAsia="Times New Roman" w:cs="Times New Roman"/>
+    </w:rPr>
   </w:style>
   <w:style w:customStyle="1" w:styleId="CaptionedFigure" w:type="paragraph">
     <w:name w:val="Captioned Figure"/>
@@ -1658,28 +2196,38 @@
     <w:pPr>
       <w:keepNext/>
     </w:pPr>
+    <w:rPr>
+      <w:rFonts w:ascii="Times New Roman" w:hAnsi="Times New Roman" w:eastAsia="Times New Roman" w:cs="Times New Roman"/>
+    </w:rPr>
   </w:style>
   <w:style w:customStyle="1" w:styleId="BodyTextChar" w:type="character">
     <w:name w:val="Body Text Char"/>
     <w:basedOn w:val="DefaultParagraphFont"/>
     <w:link w:val="BodyText"/>
+    <w:rPr>
+      <w:rFonts w:ascii="Times New Roman" w:hAnsi="Times New Roman" w:eastAsia="Times New Roman" w:cs="Times New Roman"/>
+    </w:rPr>
   </w:style>
   <w:style w:customStyle="1" w:styleId="VerbatimChar" w:type="character">
     <w:name w:val="Verbatim Char"/>
     <w:basedOn w:val="BodyTextChar"/>
     <w:rPr>
-      <w:rFonts w:ascii="Consolas" w:hAnsi="Consolas"/>
+      <w:rFonts w:ascii="Times New Roman" w:hAnsi="Times New Roman" w:eastAsia="Times New Roman" w:cs="Times New Roman"/>
       <w:sz w:val="22"/>
     </w:rPr>
   </w:style>
   <w:style w:customStyle="1" w:styleId="SectionNumber" w:type="character">
     <w:name w:val="Section Number"/>
     <w:basedOn w:val="BodyTextChar"/>
+    <w:rPr>
+      <w:rFonts w:ascii="Times New Roman" w:hAnsi="Times New Roman" w:eastAsia="Times New Roman" w:cs="Times New Roman"/>
+    </w:rPr>
   </w:style>
   <w:style w:styleId="FootnoteReference" w:type="character">
     <w:name w:val="Footnote Reference"/>
     <w:basedOn w:val="BodyTextChar"/>
     <w:rPr>
+      <w:rFonts w:ascii="Times New Roman" w:hAnsi="Times New Roman" w:eastAsia="Times New Roman" w:cs="Times New Roman"/>
       <w:vertAlign w:val="superscript"/>
     </w:rPr>
   </w:style>
@@ -1687,6 +2235,7 @@
     <w:name w:val="Hyperlink"/>
     <w:basedOn w:val="BodyTextChar"/>
     <w:rPr>
+      <w:rFonts w:ascii="Times New Roman" w:hAnsi="Times New Roman" w:eastAsia="Times New Roman" w:cs="Times New Roman"/>
       <w:color w:themeColor="accent1" w:val="4F81BD"/>
     </w:rPr>
   </w:style>
@@ -1702,7 +2251,7 @@
       <w:outlineLvl w:val="9"/>
     </w:pPr>
     <w:rPr>
-      <w:rFonts w:asciiTheme="majorHAnsi" w:cstheme="majorBidi" w:eastAsiaTheme="majorEastAsia" w:hAnsiTheme="majorHAnsi"/>
+      <w:rFonts w:ascii="Times New Roman" w:hAnsi="Times New Roman" w:eastAsia="Times New Roman" w:cs="Times New Roman"/>
       <w:b w:val="0"/>
       <w:bCs w:val="0"/>
       <w:color w:themeColor="accent1" w:themeShade="BF" w:val="365F91"/>
@@ -1715,11 +2264,15 @@
     <w:pPr>
       <w:wordWrap w:val="off"/>
     </w:pPr>
+    <w:rPr>
+      <w:rFonts w:ascii="Times New Roman" w:hAnsi="Times New Roman" w:eastAsia="Times New Roman" w:cs="Times New Roman"/>
+    </w:rPr>
   </w:style>
   <w:style w:type="character" w:customStyle="1" w:styleId="KeywordTok">
     <w:name w:val="KeywordTok"/>
     <w:basedOn w:val="VerbatimChar"/>
     <w:rPr>
+      <w:rFonts w:ascii="Times New Roman" w:hAnsi="Times New Roman" w:eastAsia="Times New Roman" w:cs="Times New Roman"/>
       <w:color w:val="007020"/>
       <w:b/>
     </w:rPr>
@@ -1728,6 +2281,7 @@
     <w:name w:val="DataTypeTok"/>
     <w:basedOn w:val="VerbatimChar"/>
     <w:rPr>
+      <w:rFonts w:ascii="Times New Roman" w:hAnsi="Times New Roman" w:eastAsia="Times New Roman" w:cs="Times New Roman"/>
       <w:color w:val="902000"/>
     </w:rPr>
   </w:style>
@@ -1735,6 +2289,7 @@
     <w:name w:val="DecValTok"/>
     <w:basedOn w:val="VerbatimChar"/>
     <w:rPr>
+      <w:rFonts w:ascii="Times New Roman" w:hAnsi="Times New Roman" w:eastAsia="Times New Roman" w:cs="Times New Roman"/>
       <w:color w:val="40a070"/>
     </w:rPr>
   </w:style>
@@ -1742,6 +2297,7 @@
     <w:name w:val="BaseNTok"/>
     <w:basedOn w:val="VerbatimChar"/>
     <w:rPr>
+      <w:rFonts w:ascii="Times New Roman" w:hAnsi="Times New Roman" w:eastAsia="Times New Roman" w:cs="Times New Roman"/>
       <w:color w:val="40a070"/>
     </w:rPr>
   </w:style>
@@ -1749,6 +2305,7 @@
     <w:name w:val="FloatTok"/>
     <w:basedOn w:val="VerbatimChar"/>
     <w:rPr>
+      <w:rFonts w:ascii="Times New Roman" w:hAnsi="Times New Roman" w:eastAsia="Times New Roman" w:cs="Times New Roman"/>
       <w:color w:val="40a070"/>
     </w:rPr>
   </w:style>
@@ -1756,6 +2313,7 @@
     <w:name w:val="ConstantTok"/>
     <w:basedOn w:val="VerbatimChar"/>
     <w:rPr>
+      <w:rFonts w:ascii="Times New Roman" w:hAnsi="Times New Roman" w:eastAsia="Times New Roman" w:cs="Times New Roman"/>
       <w:color w:val="880000"/>
     </w:rPr>
   </w:style>
@@ -1763,6 +2321,7 @@
     <w:name w:val="CharTok"/>
     <w:basedOn w:val="VerbatimChar"/>
     <w:rPr>
+      <w:rFonts w:ascii="Times New Roman" w:hAnsi="Times New Roman" w:eastAsia="Times New Roman" w:cs="Times New Roman"/>
       <w:color w:val="4070a0"/>
     </w:rPr>
   </w:style>
@@ -1770,6 +2329,7 @@
     <w:name w:val="SpecialCharTok"/>
     <w:basedOn w:val="VerbatimChar"/>
     <w:rPr>
+      <w:rFonts w:ascii="Times New Roman" w:hAnsi="Times New Roman" w:eastAsia="Times New Roman" w:cs="Times New Roman"/>
       <w:color w:val="4070a0"/>
     </w:rPr>
   </w:style>
@@ -1777,6 +2337,7 @@
     <w:name w:val="StringTok"/>
     <w:basedOn w:val="VerbatimChar"/>
     <w:rPr>
+      <w:rFonts w:ascii="Times New Roman" w:hAnsi="Times New Roman" w:eastAsia="Times New Roman" w:cs="Times New Roman"/>
       <w:color w:val="4070a0"/>
     </w:rPr>
   </w:style>
@@ -1784,6 +2345,7 @@
     <w:name w:val="VerbatimStringTok"/>
     <w:basedOn w:val="VerbatimChar"/>
     <w:rPr>
+      <w:rFonts w:ascii="Times New Roman" w:hAnsi="Times New Roman" w:eastAsia="Times New Roman" w:cs="Times New Roman"/>
       <w:color w:val="4070a0"/>
     </w:rPr>
   </w:style>
@@ -1791,6 +2353,7 @@
     <w:name w:val="SpecialStringTok"/>
     <w:basedOn w:val="VerbatimChar"/>
     <w:rPr>
+      <w:rFonts w:ascii="Times New Roman" w:hAnsi="Times New Roman" w:eastAsia="Times New Roman" w:cs="Times New Roman"/>
       <w:color w:val="bb6688"/>
     </w:rPr>
   </w:style>
@@ -1798,6 +2361,7 @@
     <w:name w:val="ImportTok"/>
     <w:basedOn w:val="VerbatimChar"/>
     <w:rPr>
+      <w:rFonts w:ascii="Times New Roman" w:hAnsi="Times New Roman" w:eastAsia="Times New Roman" w:cs="Times New Roman"/>
       <w:color w:val="008000"/>
       <w:b/>
     </w:rPr>
@@ -1806,6 +2370,7 @@
     <w:name w:val="CommentTok"/>
     <w:basedOn w:val="VerbatimChar"/>
     <w:rPr>
+      <w:rFonts w:ascii="Times New Roman" w:hAnsi="Times New Roman" w:eastAsia="Times New Roman" w:cs="Times New Roman"/>
       <w:color w:val="60a0b0"/>
       <w:i/>
     </w:rPr>
@@ -1814,6 +2379,7 @@
     <w:name w:val="DocumentationTok"/>
     <w:basedOn w:val="VerbatimChar"/>
     <w:rPr>
+      <w:rFonts w:ascii="Times New Roman" w:hAnsi="Times New Roman" w:eastAsia="Times New Roman" w:cs="Times New Roman"/>
       <w:color w:val="ba2121"/>
       <w:i/>
     </w:rPr>
@@ -1822,6 +2388,7 @@
     <w:name w:val="AnnotationTok"/>
     <w:basedOn w:val="VerbatimChar"/>
     <w:rPr>
+      <w:rFonts w:ascii="Times New Roman" w:hAnsi="Times New Roman" w:eastAsia="Times New Roman" w:cs="Times New Roman"/>
       <w:color w:val="60a0b0"/>
       <w:b/>
       <w:i/>
@@ -1831,6 +2398,7 @@
     <w:name w:val="CommentVarTok"/>
     <w:basedOn w:val="VerbatimChar"/>
     <w:rPr>
+      <w:rFonts w:ascii="Times New Roman" w:hAnsi="Times New Roman" w:eastAsia="Times New Roman" w:cs="Times New Roman"/>
       <w:color w:val="60a0b0"/>
       <w:b/>
       <w:i/>
@@ -1840,6 +2408,7 @@
     <w:name w:val="OtherTok"/>
     <w:basedOn w:val="VerbatimChar"/>
     <w:rPr>
+      <w:rFonts w:ascii="Times New Roman" w:hAnsi="Times New Roman" w:eastAsia="Times New Roman" w:cs="Times New Roman"/>
       <w:color w:val="007020"/>
     </w:rPr>
   </w:style>
@@ -1847,6 +2416,7 @@
     <w:name w:val="FunctionTok"/>
     <w:basedOn w:val="VerbatimChar"/>
     <w:rPr>
+      <w:rFonts w:ascii="Times New Roman" w:hAnsi="Times New Roman" w:eastAsia="Times New Roman" w:cs="Times New Roman"/>
       <w:color w:val="06287e"/>
     </w:rPr>
   </w:style>
@@ -1854,6 +2424,7 @@
     <w:name w:val="VariableTok"/>
     <w:basedOn w:val="VerbatimChar"/>
     <w:rPr>
+      <w:rFonts w:ascii="Times New Roman" w:hAnsi="Times New Roman" w:eastAsia="Times New Roman" w:cs="Times New Roman"/>
       <w:color w:val="19177c"/>
     </w:rPr>
   </w:style>
@@ -1861,6 +2432,7 @@
     <w:name w:val="ControlFlowTok"/>
     <w:basedOn w:val="VerbatimChar"/>
     <w:rPr>
+      <w:rFonts w:ascii="Times New Roman" w:hAnsi="Times New Roman" w:eastAsia="Times New Roman" w:cs="Times New Roman"/>
       <w:color w:val="007020"/>
       <w:b/>
     </w:rPr>
@@ -1869,6 +2441,7 @@
     <w:name w:val="OperatorTok"/>
     <w:basedOn w:val="VerbatimChar"/>
     <w:rPr>
+      <w:rFonts w:ascii="Times New Roman" w:hAnsi="Times New Roman" w:eastAsia="Times New Roman" w:cs="Times New Roman"/>
       <w:color w:val="666666"/>
     </w:rPr>
   </w:style>
@@ -1876,18 +2449,22 @@
     <w:name w:val="BuiltInTok"/>
     <w:basedOn w:val="VerbatimChar"/>
     <w:rPr>
+      <w:rFonts w:ascii="Times New Roman" w:hAnsi="Times New Roman" w:eastAsia="Times New Roman" w:cs="Times New Roman"/>
       <w:color w:val="008000"/>
     </w:rPr>
   </w:style>
   <w:style w:type="character" w:customStyle="1" w:styleId="ExtensionTok">
     <w:name w:val="ExtensionTok"/>
     <w:basedOn w:val="VerbatimChar"/>
-    <w:rPr/>
+    <w:rPr>
+      <w:rFonts w:ascii="Times New Roman" w:hAnsi="Times New Roman" w:eastAsia="Times New Roman" w:cs="Times New Roman"/>
+    </w:rPr>
   </w:style>
   <w:style w:type="character" w:customStyle="1" w:styleId="PreprocessorTok">
     <w:name w:val="PreprocessorTok"/>
     <w:basedOn w:val="VerbatimChar"/>
     <w:rPr>
+      <w:rFonts w:ascii="Times New Roman" w:hAnsi="Times New Roman" w:eastAsia="Times New Roman" w:cs="Times New Roman"/>
       <w:color w:val="bc7a00"/>
     </w:rPr>
   </w:style>
@@ -1895,18 +2472,22 @@
     <w:name w:val="AttributeTok"/>
     <w:basedOn w:val="VerbatimChar"/>
     <w:rPr>
+      <w:rFonts w:ascii="Times New Roman" w:hAnsi="Times New Roman" w:eastAsia="Times New Roman" w:cs="Times New Roman"/>
       <w:color w:val="7d9029"/>
     </w:rPr>
   </w:style>
   <w:style w:type="character" w:customStyle="1" w:styleId="RegionMarkerTok">
     <w:name w:val="RegionMarkerTok"/>
     <w:basedOn w:val="VerbatimChar"/>
-    <w:rPr/>
+    <w:rPr>
+      <w:rFonts w:ascii="Times New Roman" w:hAnsi="Times New Roman" w:eastAsia="Times New Roman" w:cs="Times New Roman"/>
+    </w:rPr>
   </w:style>
   <w:style w:type="character" w:customStyle="1" w:styleId="InformationTok">
     <w:name w:val="InformationTok"/>
     <w:basedOn w:val="VerbatimChar"/>
     <w:rPr>
+      <w:rFonts w:ascii="Times New Roman" w:hAnsi="Times New Roman" w:eastAsia="Times New Roman" w:cs="Times New Roman"/>
       <w:color w:val="60a0b0"/>
       <w:b/>
       <w:i/>
@@ -1916,6 +2497,7 @@
     <w:name w:val="WarningTok"/>
     <w:basedOn w:val="VerbatimChar"/>
     <w:rPr>
+      <w:rFonts w:ascii="Times New Roman" w:hAnsi="Times New Roman" w:eastAsia="Times New Roman" w:cs="Times New Roman"/>
       <w:color w:val="60a0b0"/>
       <w:b/>
       <w:i/>
@@ -1925,6 +2507,7 @@
     <w:name w:val="AlertTok"/>
     <w:basedOn w:val="VerbatimChar"/>
     <w:rPr>
+      <w:rFonts w:ascii="Times New Roman" w:hAnsi="Times New Roman" w:eastAsia="Times New Roman" w:cs="Times New Roman"/>
       <w:color w:val="ff0000"/>
       <w:b/>
     </w:rPr>
@@ -1933,6 +2516,7 @@
     <w:name w:val="ErrorTok"/>
     <w:basedOn w:val="VerbatimChar"/>
     <w:rPr>
+      <w:rFonts w:ascii="Times New Roman" w:hAnsi="Times New Roman" w:eastAsia="Times New Roman" w:cs="Times New Roman"/>
       <w:color w:val="ff0000"/>
       <w:b/>
     </w:rPr>
@@ -1940,7 +2524,9 @@
   <w:style w:type="character" w:customStyle="1" w:styleId="NormalTok">
     <w:name w:val="NormalTok"/>
     <w:basedOn w:val="VerbatimChar"/>
-    <w:rPr/>
+    <w:rPr>
+      <w:rFonts w:ascii="Times New Roman" w:hAnsi="Times New Roman" w:eastAsia="Times New Roman" w:cs="Times New Roman"/>
+    </w:rPr>
   </w:style>
 </w:styles>
 </file>
@@ -1988,7 +2574,7 @@
     </a:clrScheme>
     <a:fontScheme name="Office">
       <a:majorFont>
-        <a:latin typeface="Calibri"/>
+        <a:latin typeface="Times New Roman"/>
         <a:ea typeface=""/>
         <a:cs typeface=""/>
         <a:font script="Jpan" typeface="ＭＳ ゴシック"/>
@@ -2022,7 +2608,7 @@
         <a:font script="Uigh" typeface="Microsoft Uighur"/>
       </a:majorFont>
       <a:minorFont>
-        <a:latin typeface="Cambria"/>
+        <a:latin typeface="Times New Roman"/>
         <a:ea typeface=""/>
         <a:cs typeface=""/>
         <a:font script="Jpan" typeface="ＭＳ 明朝"/>

</xml_diff>